<commit_message>
barlow/finesst: tracked-changes v8 -> whole-paragraph block replaces
Per review preference: every changed paragraph is now a single strike-through-old
+ insert-new block, so one Accept/Reject swaps the whole paragraph (no word-by-word
fragments). Comments preserved; accepting all changes still reproduces clean v8.
(Markup view is 8 pp because it shows old+new stacked; accepted = 6-pp S/T/M.)

Co-Authored-By: Claude Opus 4.8 (1M context) <noreply@anthropic.com>
</commit_message>
<xml_diff>
--- a/barlow/docs/finesst_proposal_v8_tracked.docx
+++ b/barlow/docs/finesst_proposal_v8_tracked.docx
@@ -18,87 +18,16 @@
       </w:r>
     </w:p>
     <w:p>
-      <w:r>
-        <w:t xml:space="preserve">Summary: Previous work [1] has identified places where Antarctic Dry Valley streams are reshaping the land, but it stops at location and doesn’t examine the causes of stream migration. This project attempts to elucidate the drivers of channel migration. Using remote sensing and machine learning, it links the measured changes to the driving processes (heat, melt, thawing ground), </w:t>
-      </w:r>
       <w:del w:id="1001" w:author="Colton Goodrich" w:date="2026-07-09T12:00:00Z">
         <w:r>
-          <w:delText xml:space="preserve">widens</w:delText>
+          <w:delText xml:space="preserve">Summary: Previous work [1] has identified places where Antarctic Dry Valley streams are reshaping the land, but it stops at location and doesn’t examine the causes of stream migration. This project attempts to elucidate the drivers of channel migration. Using remote sensing and machine learning, it links the measured changes to the driving processes (heat, melt, thawing ground), widens the measurement from the stream channels to the whole valley floor, and attaches a real uncertainty value to every pixel.</w:delText>
         </w:r>
       </w:del>
       <w:ins w:id="1002" w:author="Colton Goodrich" w:date="2026-07-09T12:00:00Z">
         <w:r>
-          <w:t xml:space="preserve">extends</w:t>
+          <w:t xml:space="preserve">Summary: Previous work [1] has identified places where Antarctic Dry Valley streams are reshaping the land, but it stops at location and doesn’t examine the causes of stream migration. This project attempts to elucidate the drivers of channel migration. Using remote sensing and machine learning, it links the measured changes to the driving processes (heat, melt, thawing ground), extends the measurement from the channel centerline into the near-channel corridor, and attaches a real uncertainty value to every pixel.</w:t>
         </w:r>
       </w:ins>
-      <w:r>
-        <w:t xml:space="preserve"> the measurement from the </w:t>
-      </w:r>
-      <w:del w:id="1003" w:author="Colton Goodrich" w:date="2026-07-09T12:00:00Z">
-        <w:r>
-          <w:delText xml:space="preserve">stream</w:delText>
-        </w:r>
-      </w:del>
-      <w:ins w:id="1004" w:author="Colton Goodrich" w:date="2026-07-09T12:00:00Z">
-        <w:r>
-          <w:t xml:space="preserve">channel</w:t>
-        </w:r>
-      </w:ins>
-      <w:r>
-        <w:t xml:space="preserve"> </w:t>
-      </w:r>
-      <w:del w:id="1005" w:author="Colton Goodrich" w:date="2026-07-09T12:00:00Z">
-        <w:r>
-          <w:delText xml:space="preserve">channels</w:delText>
-        </w:r>
-      </w:del>
-      <w:ins w:id="1006" w:author="Colton Goodrich" w:date="2026-07-09T12:00:00Z">
-        <w:r>
-          <w:t xml:space="preserve">centerline</w:t>
-        </w:r>
-      </w:ins>
-      <w:r>
-        <w:t xml:space="preserve"> </w:t>
-      </w:r>
-      <w:del w:id="1007" w:author="Colton Goodrich" w:date="2026-07-09T12:00:00Z">
-        <w:r>
-          <w:delText xml:space="preserve">to</w:delText>
-        </w:r>
-      </w:del>
-      <w:ins w:id="1008" w:author="Colton Goodrich" w:date="2026-07-09T12:00:00Z">
-        <w:r>
-          <w:t xml:space="preserve">into</w:t>
-        </w:r>
-      </w:ins>
-      <w:r>
-        <w:t xml:space="preserve"> the </w:t>
-      </w:r>
-      <w:del w:id="1009" w:author="Colton Goodrich" w:date="2026-07-09T12:00:00Z">
-        <w:r>
-          <w:delText xml:space="preserve">whole</w:delText>
-        </w:r>
-      </w:del>
-      <w:ins w:id="1010" w:author="Colton Goodrich" w:date="2026-07-09T12:00:00Z">
-        <w:r>
-          <w:t xml:space="preserve">near-channel</w:t>
-        </w:r>
-      </w:ins>
-      <w:r>
-        <w:t xml:space="preserve"> </w:t>
-      </w:r>
-      <w:del w:id="1011" w:author="Colton Goodrich" w:date="2026-07-09T12:00:00Z">
-        <w:r>
-          <w:delText xml:space="preserve">valley floor,</w:delText>
-        </w:r>
-      </w:del>
-      <w:ins w:id="1012" w:author="Colton Goodrich" w:date="2026-07-09T12:00:00Z">
-        <w:r>
-          <w:t xml:space="preserve">corridor,</w:t>
-        </w:r>
-      </w:ins>
-      <w:r>
-        <w:t xml:space="preserve"> and attaches a real uncertainty value to every pixel.</w:t>
-      </w:r>
       <w:r/>
       <w:r/>
       <w:r/>
@@ -325,87 +254,37 @@
           <w:b/>
         </w:rPr>
       </w:pPr>
-      <w:del w:id="1013" w:author="Colton Goodrich" w:date="2026-07-09T12:00:00Z">
+      <w:del w:id="1003" w:author="Colton Goodrich" w:date="2026-07-09T12:00:00Z">
         <w:r>
           <w:rPr>
             <w:b/>
             <w:sz w:val="24"/>
           </w:rPr>
-          <w:delText xml:space="preserve">Current</w:delText>
+          <w:delText xml:space="preserve">Current Data Deficiencies</w:delText>
         </w:r>
       </w:del>
-      <w:ins w:id="1014" w:author="Colton Goodrich" w:date="2026-07-09T12:00:00Z">
+      <w:ins w:id="1004" w:author="Colton Goodrich" w:date="2026-07-09T12:00:00Z">
         <w:r>
           <w:rPr>
             <w:b/>
             <w:sz w:val="24"/>
           </w:rPr>
-          <w:t xml:space="preserve">The</w:t>
+          <w:t xml:space="preserve">The Open Question</w:t>
         </w:r>
       </w:ins>
-      <w:r>
+    </w:p>
+    <w:p>
+      <w:pPr>
         <w:rPr>
           <w:b/>
-          <w:sz w:val="24"/>
-        </w:rPr>
-        <w:t xml:space="preserve"> </w:t>
-      </w:r>
-      <w:del w:id="1015" w:author="Colton Goodrich" w:date="2026-07-09T12:00:00Z">
-        <w:r>
-          <w:rPr>
-            <w:b/>
-            <w:sz w:val="24"/>
-          </w:rPr>
-          <w:delText xml:space="preserve">Data</w:delText>
-        </w:r>
-      </w:del>
-      <w:ins w:id="1016" w:author="Colton Goodrich" w:date="2026-07-09T12:00:00Z">
-        <w:r>
-          <w:rPr>
-            <w:b/>
-            <w:sz w:val="24"/>
-          </w:rPr>
-          <w:t xml:space="preserve">Open</w:t>
-        </w:r>
-      </w:ins>
-      <w:r>
-        <w:rPr>
-          <w:b/>
-          <w:sz w:val="24"/>
-        </w:rPr>
-        <w:t xml:space="preserve"> </w:t>
-      </w:r>
-      <w:del w:id="1017" w:author="Colton Goodrich" w:date="2026-07-09T12:00:00Z">
-        <w:r>
-          <w:rPr>
-            <w:b/>
-            <w:sz w:val="24"/>
-          </w:rPr>
-          <w:delText xml:space="preserve">Deficiencies</w:delText>
-        </w:r>
-      </w:del>
-      <w:ins w:id="1018" w:author="Colton Goodrich" w:date="2026-07-09T12:00:00Z">
-        <w:r>
-          <w:rPr>
-            <w:b/>
-            <w:sz w:val="24"/>
-          </w:rPr>
-          <w:t xml:space="preserve">Question</w:t>
-        </w:r>
-      </w:ins>
-    </w:p>
-    <w:p>
-      <w:pPr>
-        <w:rPr>
-          <w:b/>
-        </w:rPr>
-      </w:pPr>
-      <w:del w:id="1019" w:author="Colton Goodrich" w:date="2026-07-09T12:00:00Z">
+        </w:rPr>
+      </w:pPr>
+      <w:del w:id="1005" w:author="Colton Goodrich" w:date="2026-07-09T12:00:00Z">
         <w:r>
           <w:delText xml:space="preserve">The current state of the art as given in the dissertation is descriptive: it identifies where change happens but does not answer the larger question of why — what are the primary driving factor(s)? Because that work was masked to the stream channels, everything the elevation differencing measured outside them (thawing ground, fans) was set aside. This proposal completes it.</w:delText>
         </w:r>
       </w:del>
-      <w:ins w:id="1020" w:author="Colton Goodrich" w:date="2026-07-09T12:00:00Z">
+      <w:ins w:id="1006" w:author="Colton Goodrich" w:date="2026-07-09T12:00:00Z">
         <w:r>
           <w:t xml:space="preserve">Detecting where channels change is now feasible; explaining why is not. The open question is which climate drivers set the rate of channel change, and whether melt energy or water volume dominates. This project attributes measured stream-channel change to those drivers and attaches calibrated per-pixel uncertainty to every measurement.</w:t>
         </w:r>
@@ -504,35 +383,16 @@
           <w:numId w:val="3"/>
         </w:numPr>
       </w:pPr>
-      <w:r>
-        <w:t xml:space="preserve">Attribution. Determination of  which climate drivers control each stream's rate of geomorphic change. Candidate drivers </w:t>
-      </w:r>
-      <w:del w:id="1021" w:author="Colton Goodrich" w:date="2026-07-09T12:00:00Z">
+      <w:del w:id="1007" w:author="Colton Goodrich" w:date="2026-07-09T12:00:00Z">
         <w:r>
-          <w:delText xml:space="preserve">include:</w:delText>
+          <w:delText xml:space="preserve">Attribution. Determination of  which climate drivers control each stream's rate of geomorphic change. Candidate drivers include: air temperature, incoming sunlight, meltwater discharge, glacial mass, and summer thaw. We hypothesize that melt energy will predict sediment movement better than water volume alone. The hypothesis is testable: if discharge alone correlates with channel migration rate then the hypothesis fails.</w:delText>
         </w:r>
       </w:del>
-      <w:ins w:id="1022" w:author="Colton Goodrich" w:date="2026-07-09T12:00:00Z">
+      <w:ins w:id="1008" w:author="Colton Goodrich" w:date="2026-07-09T12:00:00Z">
         <w:r>
-          <w:t xml:space="preserve">— drawn from MDV-LTER station records [6] and the ERA5 reanalysis [7] — are</w:t>
+          <w:t xml:space="preserve">Attribution. Determination of  which climate drivers control each stream's rate of geomorphic change. Candidate drivers — drawn from MDV-LTER station records [6] and the ERA5 reanalysis [7] — are air temperature, incoming sunlight, meltwater discharge, glacial mass balance, and summer thaw. We hypothesize that melt energy will predict sediment movement better than water volume alone. The hypothesis is testable: if discharge alone correlates with channel migration rate then the hypothesis fails.</w:t>
         </w:r>
       </w:ins>
-      <w:r>
-        <w:t xml:space="preserve"> air temperature, incoming sunlight, meltwater discharge, glacial </w:t>
-      </w:r>
-      <w:del w:id="1023" w:author="Colton Goodrich" w:date="2026-07-09T12:00:00Z">
-        <w:r>
-          <w:delText xml:space="preserve">mass,</w:delText>
-        </w:r>
-      </w:del>
-      <w:ins w:id="1024" w:author="Colton Goodrich" w:date="2026-07-09T12:00:00Z">
-        <w:r>
-          <w:t xml:space="preserve">mass balance,</w:t>
-        </w:r>
-      </w:ins>
-      <w:r>
-        <w:t xml:space="preserve"> and summer thaw. We hypothesize that melt energy will predict sediment movement better than water volume alone. The hypothesis is testable: if discharge alone correlates with channel migration rate then the hypothesis fails.</w:t>
-      </w:r>
       <w:commentRangeStart w:id="80"/>
       <w:commentRangeEnd w:id="80"/>
       <w:r>
@@ -553,207 +413,14 @@
         </w:numPr>
       </w:pPr>
       <w:commentRangeStart w:id="92"/>
-      <w:del w:id="1025" w:author="Colton Goodrich" w:date="2026-07-09T12:00:00Z">
+      <w:del w:id="1009" w:author="Colton Goodrich" w:date="2026-07-09T12:00:00Z">
         <w:r>
-          <w:delText xml:space="preserve">Landscape-wide</w:delText>
+          <w:delText xml:space="preserve">Landscape-wide geomorphic change. Extend the measurement from the stream channels to the whole valley floor, and classify each patch of change by process: channel shift or avulsion, thaw subsidence, slope movement, fan growth, and lake-margin change.</w:delText>
         </w:r>
       </w:del>
-      <w:ins w:id="1026" w:author="Colton Goodrich" w:date="2026-07-09T12:00:00Z">
+      <w:ins w:id="1010" w:author="Colton Goodrich" w:date="2026-07-09T12:00:00Z">
         <w:r>
-          <w:t xml:space="preserve">Process</w:t>
-        </w:r>
-      </w:ins>
-      <w:r>
-        <w:t xml:space="preserve"> </w:t>
-      </w:r>
-      <w:del w:id="1027" w:author="Colton Goodrich" w:date="2026-07-09T12:00:00Z">
-        <w:r>
-          <w:delText xml:space="preserve">geomorphic</w:delText>
-        </w:r>
-      </w:del>
-      <w:ins w:id="1028" w:author="Colton Goodrich" w:date="2026-07-09T12:00:00Z">
-        <w:r>
-          <w:t xml:space="preserve">attribution</w:t>
-        </w:r>
-      </w:ins>
-      <w:r>
-        <w:t xml:space="preserve"> </w:t>
-      </w:r>
-      <w:del w:id="1029" w:author="Colton Goodrich" w:date="2026-07-09T12:00:00Z">
-        <w:r>
-          <w:delText xml:space="preserve">change. Extend the measurement from</w:delText>
-        </w:r>
-      </w:del>
-      <w:ins w:id="1030" w:author="Colton Goodrich" w:date="2026-07-09T12:00:00Z">
-        <w:r>
-          <w:t xml:space="preserve">along</w:t>
-        </w:r>
-      </w:ins>
-      <w:r>
-        <w:t xml:space="preserve"> the stream </w:t>
-      </w:r>
-      <w:del w:id="1031" w:author="Colton Goodrich" w:date="2026-07-09T12:00:00Z">
-        <w:r>
-          <w:delText xml:space="preserve">channels</w:delText>
-        </w:r>
-      </w:del>
-      <w:ins w:id="1032" w:author="Colton Goodrich" w:date="2026-07-09T12:00:00Z">
-        <w:r>
-          <w:t xml:space="preserve">corridor.</w:t>
-        </w:r>
-      </w:ins>
-      <w:r>
-        <w:t xml:space="preserve"> </w:t>
-      </w:r>
-      <w:del w:id="1033" w:author="Colton Goodrich" w:date="2026-07-09T12:00:00Z">
-        <w:r>
-          <w:delText xml:space="preserve">to</w:delText>
-        </w:r>
-      </w:del>
-      <w:ins w:id="1034" w:author="Colton Goodrich" w:date="2026-07-09T12:00:00Z">
-        <w:r>
-          <w:t xml:space="preserve">Beyond</w:t>
-        </w:r>
-      </w:ins>
-      <w:r>
-        <w:t xml:space="preserve"> the </w:t>
-      </w:r>
-      <w:del w:id="1035" w:author="Colton Goodrich" w:date="2026-07-09T12:00:00Z">
-        <w:r>
-          <w:delText xml:space="preserve">whole</w:delText>
-        </w:r>
-      </w:del>
-      <w:ins w:id="1036" w:author="Colton Goodrich" w:date="2026-07-09T12:00:00Z">
-        <w:r>
-          <w:t xml:space="preserve">channel</w:t>
-        </w:r>
-      </w:ins>
-      <w:r>
-        <w:t xml:space="preserve"> </w:t>
-      </w:r>
-      <w:del w:id="1037" w:author="Colton Goodrich" w:date="2026-07-09T12:00:00Z">
-        <w:r>
-          <w:delText xml:space="preserve">valley floor, and</w:delText>
-        </w:r>
-      </w:del>
-      <w:ins w:id="1038" w:author="Colton Goodrich" w:date="2026-07-09T12:00:00Z">
-        <w:r>
-          <w:t xml:space="preserve">centerline,</w:t>
-        </w:r>
-      </w:ins>
-      <w:r>
-        <w:t xml:space="preserve"> classify </w:t>
-      </w:r>
-      <w:del w:id="1039" w:author="Colton Goodrich" w:date="2026-07-09T12:00:00Z">
-        <w:r>
-          <w:delText xml:space="preserve">each patch of </w:delText>
-        </w:r>
-      </w:del>
-      <w:r>
-        <w:t xml:space="preserve">change </w:t>
-      </w:r>
-      <w:del w:id="1040" w:author="Colton Goodrich" w:date="2026-07-09T12:00:00Z">
-        <w:r>
-          <w:delText xml:space="preserve">by</w:delText>
-        </w:r>
-      </w:del>
-      <w:ins w:id="1041" w:author="Colton Goodrich" w:date="2026-07-09T12:00:00Z">
-        <w:r>
-          <w:t xml:space="preserve">in</w:t>
-        </w:r>
-      </w:ins>
-      <w:r>
-        <w:t xml:space="preserve"> </w:t>
-      </w:r>
-      <w:del w:id="1042" w:author="Colton Goodrich" w:date="2026-07-09T12:00:00Z">
-        <w:r>
-          <w:delText xml:space="preserve">process:</w:delText>
-        </w:r>
-      </w:del>
-      <w:ins w:id="1043" w:author="Colton Goodrich" w:date="2026-07-09T12:00:00Z">
-        <w:r>
-          <w:t xml:space="preserve">the near-channel corridor —</w:t>
-        </w:r>
-      </w:ins>
-      <w:r>
-        <w:t xml:space="preserve"> channel shift </w:t>
-      </w:r>
-      <w:del w:id="1044" w:author="Colton Goodrich" w:date="2026-07-09T12:00:00Z">
-        <w:r>
-          <w:delText xml:space="preserve">or</w:delText>
-        </w:r>
-      </w:del>
-      <w:ins w:id="1045" w:author="Colton Goodrich" w:date="2026-07-09T12:00:00Z">
-        <w:r>
-          <w:t xml:space="preserve">and</w:t>
-        </w:r>
-      </w:ins>
-      <w:r>
-        <w:t xml:space="preserve"> avulsion, </w:t>
-      </w:r>
-      <w:ins w:id="1046" w:author="Colton Goodrich" w:date="2026-07-09T12:00:00Z">
-        <w:r>
-          <w:t xml:space="preserve">bank </w:t>
-        </w:r>
-      </w:ins>
-      <w:r>
-        <w:t xml:space="preserve">thaw</w:t>
-      </w:r>
-      <w:ins w:id="1047" w:author="Colton Goodrich" w:date="2026-07-09T12:00:00Z">
-        <w:r>
-          <w:t xml:space="preserve"> and</w:t>
-        </w:r>
-      </w:ins>
-      <w:r>
-        <w:t xml:space="preserve"> subsidence, </w:t>
-      </w:r>
-      <w:del w:id="1048" w:author="Colton Goodrich" w:date="2026-07-09T12:00:00Z">
-        <w:r>
-          <w:delText xml:space="preserve">slope movement,</w:delText>
-        </w:r>
-      </w:del>
-      <w:ins w:id="1049" w:author="Colton Goodrich" w:date="2026-07-09T12:00:00Z">
-        <w:r>
-          <w:t xml:space="preserve">and</w:t>
-        </w:r>
-      </w:ins>
-      <w:r>
-        <w:t xml:space="preserve"> fan </w:t>
-      </w:r>
-      <w:del w:id="1050" w:author="Colton Goodrich" w:date="2026-07-09T12:00:00Z">
-        <w:r>
-          <w:delText xml:space="preserve">growth,</w:delText>
-        </w:r>
-      </w:del>
-      <w:ins w:id="1051" w:author="Colton Goodrich" w:date="2026-07-09T12:00:00Z">
-        <w:r>
-          <w:t xml:space="preserve">growth — by process type. Bedrock</w:t>
-        </w:r>
-      </w:ins>
-      <w:r>
-        <w:t xml:space="preserve"> and </w:t>
-      </w:r>
-      <w:del w:id="1052" w:author="Colton Goodrich" w:date="2026-07-09T12:00:00Z">
-        <w:r>
-          <w:delText xml:space="preserve">lake-margin</w:delText>
-        </w:r>
-      </w:del>
-      <w:ins w:id="1053" w:author="Colton Goodrich" w:date="2026-07-09T12:00:00Z">
-        <w:r>
-          <w:t xml:space="preserve">stable</w:t>
-        </w:r>
-      </w:ins>
-      <w:r>
-        <w:t xml:space="preserve"> </w:t>
-      </w:r>
-      <w:del w:id="1054" w:author="Colton Goodrich" w:date="2026-07-09T12:00:00Z">
-        <w:r>
-          <w:delText xml:space="preserve">change.</w:delText>
-        </w:r>
-      </w:del>
-      <w:ins w:id="1055" w:author="Colton Goodrich" w:date="2026-07-09T12:00:00Z">
-        <w:r>
-          <w:t xml:space="preserve">soils outside the corridor provide the fixed control needed to co-register the sensors, so every change is measured against genuinely stable ground.</w:t>
+          <w:t xml:space="preserve">Process attribution along the stream corridor. Beyond the channel centerline, classify change in the near-channel corridor — channel shift and avulsion, bank thaw and subsidence, and fan growth — by process type. Bedrock and stable soils outside the corridor provide the fixed control needed to co-register the sensors, so every change is measured against genuinely stable ground.</w:t>
         </w:r>
       </w:ins>
       <w:commentRangeEnd w:id="92"/>
@@ -784,35 +451,16 @@
         </w:numPr>
       </w:pPr>
       <w:commentRangeStart w:id="93"/>
-      <w:r>
-        <w:t xml:space="preserve">Calibrated uncertainty. </w:t>
-      </w:r>
-      <w:del w:id="1056" w:author="Colton Goodrich" w:date="2026-07-09T12:00:00Z">
+      <w:del w:id="1011" w:author="Colton Goodrich" w:date="2026-07-09T12:00:00Z">
         <w:r>
-          <w:delText xml:space="preserve">Replace the dissertation's single valley-wide noise estimate with</w:delText>
+          <w:delText xml:space="preserve">Calibrated uncertainty. Replace the dissertation's single valley-wide noise estimate with a per-pixel detection threshold for slope, aspect, and sensor. Success test: on ground that did not change, a 95% confidence threshold should be exceeded by 5% of pixels.</w:delText>
         </w:r>
       </w:del>
-      <w:ins w:id="1057" w:author="Colton Goodrich" w:date="2026-07-09T12:00:00Z">
+      <w:ins w:id="1012" w:author="Colton Goodrich" w:date="2026-07-09T12:00:00Z">
         <w:r>
-          <w:t xml:space="preserve">Provide</w:t>
+          <w:t xml:space="preserve">Calibrated uncertainty. Provide a per-pixel detection threshold for slope, aspect, and sensor, in place of a single valley-wide noise value. Success test: on ground that did not change, a 95% confidence threshold should be exceeded by 5% of pixels.</w:t>
         </w:r>
       </w:ins>
-      <w:r>
-        <w:t xml:space="preserve"> a per-pixel detection threshold for slope, aspect, and </w:t>
-      </w:r>
-      <w:del w:id="1058" w:author="Colton Goodrich" w:date="2026-07-09T12:00:00Z">
-        <w:r>
-          <w:delText xml:space="preserve">sensor.</w:delText>
-        </w:r>
-      </w:del>
-      <w:ins w:id="1059" w:author="Colton Goodrich" w:date="2026-07-09T12:00:00Z">
-        <w:r>
-          <w:t xml:space="preserve">sensor, in place of a single valley-wide noise value.</w:t>
-        </w:r>
-      </w:ins>
-      <w:r>
-        <w:t xml:space="preserve"> Success test: on ground that did not change, a 95% confidence threshold should be exceeded by 5% of pixels.</w:t>
-      </w:r>
       <w:commentRangeEnd w:id="93"/>
       <w:r>
         <w:rPr>
@@ -892,70 +540,26 @@
         <w:jc w:val="center"/>
       </w:pPr>
       <w:commentRangeStart w:id="94"/>
-      <w:r>
-        <w:rPr>
-          <w:i/>
-          <w:color w:val="404040"/>
-          <w:sz w:val="18"/>
-        </w:rPr>
-        <w:t xml:space="preserve">Figure 2. Planned detection-to-attribution workflow: three DEM epochs, </w:t>
-      </w:r>
-      <w:del w:id="1060" w:author="Colton Goodrich" w:date="2026-07-09T12:00:00Z">
+      <w:del w:id="1013" w:author="Colton Goodrich" w:date="2026-07-09T12:00:00Z">
         <w:r>
           <w:rPr>
             <w:i/>
             <w:color w:val="404040"/>
             <w:sz w:val="18"/>
           </w:rPr>
-          <w:delText xml:space="preserve">co-registration,</w:delText>
+          <w:delText xml:space="preserve">Figure 2. Planned detection-to-attribution workflow: three DEM epochs, co-registration, DEM-of-Difference, per-pixel detection floor, then the O1 (channel), O2 (valley-floor), and O3 (uncertainty) objectives. Method schematic; no results shown.</w:delText>
         </w:r>
       </w:del>
-      <w:ins w:id="1061" w:author="Colton Goodrich" w:date="2026-07-09T12:00:00Z">
+      <w:ins w:id="1014" w:author="Colton Goodrich" w:date="2026-07-09T12:00:00Z">
         <w:r>
           <w:rPr>
             <w:i/>
             <w:color w:val="404040"/>
             <w:sz w:val="18"/>
           </w:rPr>
-          <w:t xml:space="preserve">co-registration to airborne-lidar and ICESat-2 control,</w:t>
+          <w:t xml:space="preserve">Figure 2. Planned detection-to-attribution workflow: three DEM epochs, co-registration to airborne-lidar and ICESat-2 control, DEM-of-Difference, per-pixel detection floor, then the O1 (channel), O2 (stream-corridor), and O3 (uncertainty) objectives. Method schematic; no results shown.</w:t>
         </w:r>
       </w:ins>
-      <w:r>
-        <w:rPr>
-          <w:i/>
-          <w:color w:val="404040"/>
-          <w:sz w:val="18"/>
-        </w:rPr>
-        <w:t xml:space="preserve"> DEM-of-Difference, per-pixel detection floor, then the O1 (channel), O2 </w:t>
-      </w:r>
-      <w:del w:id="1062" w:author="Colton Goodrich" w:date="2026-07-09T12:00:00Z">
-        <w:r>
-          <w:rPr>
-            <w:i/>
-            <w:color w:val="404040"/>
-            <w:sz w:val="18"/>
-          </w:rPr>
-          <w:delText xml:space="preserve">(valley-floor),</w:delText>
-        </w:r>
-      </w:del>
-      <w:ins w:id="1063" w:author="Colton Goodrich" w:date="2026-07-09T12:00:00Z">
-        <w:r>
-          <w:rPr>
-            <w:i/>
-            <w:color w:val="404040"/>
-            <w:sz w:val="18"/>
-          </w:rPr>
-          <w:t xml:space="preserve">(stream-corridor),</w:t>
-        </w:r>
-      </w:ins>
-      <w:r>
-        <w:rPr>
-          <w:i/>
-          <w:color w:val="404040"/>
-          <w:sz w:val="18"/>
-        </w:rPr>
-        <w:t xml:space="preserve"> and O3 (uncertainty) objectives. Method schematic; no results shown.</w:t>
-      </w:r>
       <w:commentRangeEnd w:id="94"/>
       <w:r>
         <w:rPr>
@@ -986,103 +590,16 @@
         </w:numPr>
       </w:pPr>
       <w:commentRangeStart w:id="95"/>
-      <w:del w:id="1064" w:author="Colton Goodrich" w:date="2026-07-09T12:00:00Z">
+      <w:del w:id="1015" w:author="Colton Goodrich" w:date="2026-07-09T12:00:00Z">
         <w:r>
-          <w:delText xml:space="preserve">Compute</w:delText>
+          <w:delText xml:space="preserve">Compute each gauged stream's change rate. First I co-register the two elevation epochs (removing the median vertical offset over stable ground, with an optional ICP refinement), resample them to a shared grid, and difference them. I keep only pixels whose change clears the detection floor (the per-pixel LOD95 threshold from objective 3), sum that change inside the stream's channel outline, and normalize by channel area and years elapsed to a specific rate in mm/yr.</w:delText>
         </w:r>
       </w:del>
-      <w:ins w:id="1065" w:author="Colton Goodrich" w:date="2026-07-09T12:00:00Z">
+      <w:ins w:id="1016" w:author="Colton Goodrich" w:date="2026-07-09T12:00:00Z">
         <w:r>
-          <w:t xml:space="preserve">Objective 1 tests whether melt energy predicts channel change better than water volume alone. To test it, I measure</w:t>
+          <w:t xml:space="preserve">Objective 1 tests whether melt energy predicts channel change better than water volume alone. To test it, I measure each gauged stream's change rate: co-register the two elevation epochs (removing the median vertical offset over stable ground, with an optional ICP refinement), resample to a shared grid, difference them, keep only pixels whose change clears the detection floor (the per-pixel LOD95 threshold from objective 3), and integrate that change inside the channel outline, normalized by channel area and years elapsed to a rate in mm/yr.</w:t>
         </w:r>
       </w:ins>
-      <w:r>
-        <w:t xml:space="preserve"> each gauged stream's change </w:t>
-      </w:r>
-      <w:del w:id="1066" w:author="Colton Goodrich" w:date="2026-07-09T12:00:00Z">
-        <w:r>
-          <w:delText xml:space="preserve">rate. First I</w:delText>
-        </w:r>
-      </w:del>
-      <w:ins w:id="1067" w:author="Colton Goodrich" w:date="2026-07-09T12:00:00Z">
-        <w:r>
-          <w:t xml:space="preserve">rate:</w:t>
-        </w:r>
-      </w:ins>
-      <w:r>
-        <w:t xml:space="preserve"> co-register the two elevation epochs (removing the median vertical offset over stable ground, with an optional ICP refinement), resample </w:t>
-      </w:r>
-      <w:del w:id="1068" w:author="Colton Goodrich" w:date="2026-07-09T12:00:00Z">
-        <w:r>
-          <w:delText xml:space="preserve">them </w:delText>
-        </w:r>
-      </w:del>
-      <w:r>
-        <w:t xml:space="preserve">to a shared grid, </w:t>
-      </w:r>
-      <w:del w:id="1069" w:author="Colton Goodrich" w:date="2026-07-09T12:00:00Z">
-        <w:r>
-          <w:delText xml:space="preserve">and </w:delText>
-        </w:r>
-      </w:del>
-      <w:r>
-        <w:t xml:space="preserve">difference </w:t>
-      </w:r>
-      <w:del w:id="1070" w:author="Colton Goodrich" w:date="2026-07-09T12:00:00Z">
-        <w:r>
-          <w:delText xml:space="preserve">them. I</w:delText>
-        </w:r>
-      </w:del>
-      <w:ins w:id="1071" w:author="Colton Goodrich" w:date="2026-07-09T12:00:00Z">
-        <w:r>
-          <w:t xml:space="preserve">them,</w:t>
-        </w:r>
-      </w:ins>
-      <w:r>
-        <w:t xml:space="preserve"> keep only pixels whose change clears the detection floor (the per-pixel LOD95 threshold from objective 3), </w:t>
-      </w:r>
-      <w:del w:id="1072" w:author="Colton Goodrich" w:date="2026-07-09T12:00:00Z">
-        <w:r>
-          <w:delText xml:space="preserve">sum</w:delText>
-        </w:r>
-      </w:del>
-      <w:ins w:id="1073" w:author="Colton Goodrich" w:date="2026-07-09T12:00:00Z">
-        <w:r>
-          <w:t xml:space="preserve">and integrate</w:t>
-        </w:r>
-      </w:ins>
-      <w:r>
-        <w:t xml:space="preserve"> that change inside the </w:t>
-      </w:r>
-      <w:del w:id="1074" w:author="Colton Goodrich" w:date="2026-07-09T12:00:00Z">
-        <w:r>
-          <w:delText xml:space="preserve">stream's </w:delText>
-        </w:r>
-      </w:del>
-      <w:r>
-        <w:t xml:space="preserve">channel outline, </w:t>
-      </w:r>
-      <w:del w:id="1075" w:author="Colton Goodrich" w:date="2026-07-09T12:00:00Z">
-        <w:r>
-          <w:delText xml:space="preserve">and normalize</w:delText>
-        </w:r>
-      </w:del>
-      <w:ins w:id="1076" w:author="Colton Goodrich" w:date="2026-07-09T12:00:00Z">
-        <w:r>
-          <w:t xml:space="preserve">normalized</w:t>
-        </w:r>
-      </w:ins>
-      <w:r>
-        <w:t xml:space="preserve"> by channel area and years elapsed to a </w:t>
-      </w:r>
-      <w:del w:id="1077" w:author="Colton Goodrich" w:date="2026-07-09T12:00:00Z">
-        <w:r>
-          <w:delText xml:space="preserve">specific </w:delText>
-        </w:r>
-      </w:del>
-      <w:r>
-        <w:t xml:space="preserve">rate in mm/yr.</w:t>
-      </w:r>
     </w:p>
     <w:p>
       <w:pPr>
@@ -1138,246 +655,14 @@
           <w:numId w:val="6"/>
         </w:numPr>
       </w:pPr>
-      <w:r>
-        <w:t xml:space="preserve">Apply the objective-3 per-pixel thresholds </w:t>
-      </w:r>
-      <w:del w:id="1078" w:author="Colton Goodrich" w:date="2026-07-09T12:00:00Z">
+      <w:del w:id="1017" w:author="Colton Goodrich" w:date="2026-07-09T12:00:00Z">
         <w:r>
-          <w:delText xml:space="preserve">across</w:delText>
+          <w:delText xml:space="preserve">Apply the objective-3 per-pixel thresholds across the whole valley floor and pull out each change patch as a connected group of super-threshold pixels. I drop patches below a minimum mapping unit (a few pixels) to suppress isolated-pixel noise, and screen out near-level standing water, whose apparent change is lake-level rise, not ground change — those go to the lake-margin class and lake-level driver instead.</w:delText>
         </w:r>
       </w:del>
-      <w:ins w:id="1079" w:author="Colton Goodrich" w:date="2026-07-09T12:00:00Z">
+      <w:ins w:id="1018" w:author="Colton Goodrich" w:date="2026-07-09T12:00:00Z">
         <w:r>
-          <w:t xml:space="preserve">along</w:t>
-        </w:r>
-      </w:ins>
-      <w:r>
-        <w:t xml:space="preserve"> the </w:t>
-      </w:r>
-      <w:del w:id="1080" w:author="Colton Goodrich" w:date="2026-07-09T12:00:00Z">
-        <w:r>
-          <w:delText xml:space="preserve">whole</w:delText>
-        </w:r>
-      </w:del>
-      <w:ins w:id="1081" w:author="Colton Goodrich" w:date="2026-07-09T12:00:00Z">
-        <w:r>
-          <w:t xml:space="preserve">stream</w:t>
-        </w:r>
-      </w:ins>
-      <w:r>
-        <w:t xml:space="preserve"> </w:t>
-      </w:r>
-      <w:del w:id="1082" w:author="Colton Goodrich" w:date="2026-07-09T12:00:00Z">
-        <w:r>
-          <w:delText xml:space="preserve">valley floor</w:delText>
-        </w:r>
-      </w:del>
-      <w:ins w:id="1083" w:author="Colton Goodrich" w:date="2026-07-09T12:00:00Z">
-        <w:r>
-          <w:t xml:space="preserve">corridor</w:t>
-        </w:r>
-      </w:ins>
-      <w:r>
-        <w:t xml:space="preserve"> and pull out each change patch as a connected group of super-threshold </w:t>
-      </w:r>
-      <w:del w:id="1084" w:author="Colton Goodrich" w:date="2026-07-09T12:00:00Z">
-        <w:r>
-          <w:delText xml:space="preserve">pixels.</w:delText>
-        </w:r>
-      </w:del>
-      <w:ins w:id="1085" w:author="Colton Goodrich" w:date="2026-07-09T12:00:00Z">
-        <w:r>
-          <w:t xml:space="preserve">pixels,</w:t>
-        </w:r>
-      </w:ins>
-      <w:r>
-        <w:t xml:space="preserve"> </w:t>
-      </w:r>
-      <w:del w:id="1086" w:author="Colton Goodrich" w:date="2026-07-09T12:00:00Z">
-        <w:r>
-          <w:delText xml:space="preserve">I drop</w:delText>
-        </w:r>
-      </w:del>
-      <w:ins w:id="1087" w:author="Colton Goodrich" w:date="2026-07-09T12:00:00Z">
-        <w:r>
-          <w:t xml:space="preserve">dropping</w:t>
-        </w:r>
-      </w:ins>
-      <w:r>
-        <w:t xml:space="preserve"> patches below a minimum mapping unit </w:t>
-      </w:r>
-      <w:del w:id="1088" w:author="Colton Goodrich" w:date="2026-07-09T12:00:00Z">
-        <w:r>
-          <w:delText xml:space="preserve">(a few pixels) </w:delText>
-        </w:r>
-      </w:del>
-      <w:r>
-        <w:t xml:space="preserve">to suppress isolated-pixel </w:t>
-      </w:r>
-      <w:del w:id="1089" w:author="Colton Goodrich" w:date="2026-07-09T12:00:00Z">
-        <w:r>
-          <w:delText xml:space="preserve">noise,</w:delText>
-        </w:r>
-      </w:del>
-      <w:ins w:id="1090" w:author="Colton Goodrich" w:date="2026-07-09T12:00:00Z">
-        <w:r>
-          <w:t xml:space="preserve">noise. Bedrock</w:t>
-        </w:r>
-      </w:ins>
-      <w:r>
-        <w:t xml:space="preserve"> and </w:t>
-      </w:r>
-      <w:del w:id="1091" w:author="Colton Goodrich" w:date="2026-07-09T12:00:00Z">
-        <w:r>
-          <w:delText xml:space="preserve">screen</w:delText>
-        </w:r>
-      </w:del>
-      <w:ins w:id="1092" w:author="Colton Goodrich" w:date="2026-07-09T12:00:00Z">
-        <w:r>
-          <w:t xml:space="preserve">stable</w:t>
-        </w:r>
-      </w:ins>
-      <w:r>
-        <w:t xml:space="preserve"> </w:t>
-      </w:r>
-      <w:del w:id="1093" w:author="Colton Goodrich" w:date="2026-07-09T12:00:00Z">
-        <w:r>
-          <w:delText xml:space="preserve">out</w:delText>
-        </w:r>
-      </w:del>
-      <w:ins w:id="1094" w:author="Colton Goodrich" w:date="2026-07-09T12:00:00Z">
-        <w:r>
-          <w:t xml:space="preserve">soils</w:t>
-        </w:r>
-      </w:ins>
-      <w:r>
-        <w:t xml:space="preserve"> </w:t>
-      </w:r>
-      <w:del w:id="1095" w:author="Colton Goodrich" w:date="2026-07-09T12:00:00Z">
-        <w:r>
-          <w:delText xml:space="preserve">near-level</w:delText>
-        </w:r>
-      </w:del>
-      <w:ins w:id="1096" w:author="Colton Goodrich" w:date="2026-07-09T12:00:00Z">
-        <w:r>
-          <w:t xml:space="preserve">flanking</w:t>
-        </w:r>
-      </w:ins>
-      <w:r>
-        <w:t xml:space="preserve"> </w:t>
-      </w:r>
-      <w:del w:id="1097" w:author="Colton Goodrich" w:date="2026-07-09T12:00:00Z">
-        <w:r>
-          <w:delText xml:space="preserve">standing</w:delText>
-        </w:r>
-      </w:del>
-      <w:ins w:id="1098" w:author="Colton Goodrich" w:date="2026-07-09T12:00:00Z">
-        <w:r>
-          <w:t xml:space="preserve">the</w:t>
-        </w:r>
-      </w:ins>
-      <w:r>
-        <w:t xml:space="preserve"> </w:t>
-      </w:r>
-      <w:del w:id="1099" w:author="Colton Goodrich" w:date="2026-07-09T12:00:00Z">
-        <w:r>
-          <w:delText xml:space="preserve">water,</w:delText>
-        </w:r>
-      </w:del>
-      <w:ins w:id="1100" w:author="Colton Goodrich" w:date="2026-07-09T12:00:00Z">
-        <w:r>
-          <w:t xml:space="preserve">corridor</w:t>
-        </w:r>
-      </w:ins>
-      <w:r>
-        <w:t xml:space="preserve"> </w:t>
-      </w:r>
-      <w:del w:id="1101" w:author="Colton Goodrich" w:date="2026-07-09T12:00:00Z">
-        <w:r>
-          <w:delText xml:space="preserve">whose</w:delText>
-        </w:r>
-      </w:del>
-      <w:ins w:id="1102" w:author="Colton Goodrich" w:date="2026-07-09T12:00:00Z">
-        <w:r>
-          <w:t xml:space="preserve">supply</w:t>
-        </w:r>
-      </w:ins>
-      <w:r>
-        <w:t xml:space="preserve"> </w:t>
-      </w:r>
-      <w:del w:id="1103" w:author="Colton Goodrich" w:date="2026-07-09T12:00:00Z">
-        <w:r>
-          <w:delText xml:space="preserve">apparent</w:delText>
-        </w:r>
-      </w:del>
-      <w:ins w:id="1104" w:author="Colton Goodrich" w:date="2026-07-09T12:00:00Z">
-        <w:r>
-          <w:t xml:space="preserve">the fixed reference used to co-register the sensors, so</w:t>
-        </w:r>
-      </w:ins>
-      <w:r>
-        <w:t xml:space="preserve"> change is </w:t>
-      </w:r>
-      <w:del w:id="1105" w:author="Colton Goodrich" w:date="2026-07-09T12:00:00Z">
-        <w:r>
-          <w:delText xml:space="preserve">lake-level</w:delText>
-        </w:r>
-      </w:del>
-      <w:ins w:id="1106" w:author="Colton Goodrich" w:date="2026-07-09T12:00:00Z">
-        <w:r>
-          <w:t xml:space="preserve">measured</w:t>
-        </w:r>
-      </w:ins>
-      <w:r>
-        <w:t xml:space="preserve"> </w:t>
-      </w:r>
-      <w:del w:id="1107" w:author="Colton Goodrich" w:date="2026-07-09T12:00:00Z">
-        <w:r>
-          <w:delText xml:space="preserve">rise,</w:delText>
-        </w:r>
-      </w:del>
-      <w:ins w:id="1108" w:author="Colton Goodrich" w:date="2026-07-09T12:00:00Z">
-        <w:r>
-          <w:t xml:space="preserve">against</w:t>
-        </w:r>
-      </w:ins>
-      <w:r>
-        <w:t xml:space="preserve"> </w:t>
-      </w:r>
-      <w:del w:id="1109" w:author="Colton Goodrich" w:date="2026-07-09T12:00:00Z">
-        <w:r>
-          <w:delText xml:space="preserve">not</w:delText>
-        </w:r>
-      </w:del>
-      <w:ins w:id="1110" w:author="Colton Goodrich" w:date="2026-07-09T12:00:00Z">
-        <w:r>
-          <w:t xml:space="preserve">genuinely</w:t>
-        </w:r>
-      </w:ins>
-      <w:r>
-        <w:t xml:space="preserve"> </w:t>
-      </w:r>
-      <w:del w:id="1111" w:author="Colton Goodrich" w:date="2026-07-09T12:00:00Z">
-        <w:r>
-          <w:delText xml:space="preserve">ground</w:delText>
-        </w:r>
-      </w:del>
-      <w:ins w:id="1112" w:author="Colton Goodrich" w:date="2026-07-09T12:00:00Z">
-        <w:r>
-          <w:t xml:space="preserve">stable</w:t>
-        </w:r>
-      </w:ins>
-      <w:r>
-        <w:t xml:space="preserve"> </w:t>
-      </w:r>
-      <w:del w:id="1113" w:author="Colton Goodrich" w:date="2026-07-09T12:00:00Z">
-        <w:r>
-          <w:delText xml:space="preserve">change — those go to the lake-margin class and lake-level driver instead.</w:delText>
-        </w:r>
-      </w:del>
-      <w:ins w:id="1114" w:author="Colton Goodrich" w:date="2026-07-09T12:00:00Z">
-        <w:r>
-          <w:t xml:space="preserve">ground.</w:t>
+          <w:t xml:space="preserve">Apply the objective-3 per-pixel thresholds along the stream corridor and pull out each change patch as a connected group of super-threshold pixels, dropping patches below a minimum mapping unit to suppress isolated-pixel noise. Bedrock and stable soils flanking the corridor supply the fixed reference used to co-register the sensors, so change is measured against genuinely stable ground.</w:t>
         </w:r>
       </w:ins>
     </w:p>
@@ -2021,14 +1306,14 @@
       </w:tr>
       <w:tr>
         <w:trPr>
-          <w:ins w:id="1192" w:author="Colton Goodrich" w:date="2026-07-09T12:00:00Z"/>
+          <w:ins w:id="1029" w:author="Colton Goodrich" w:date="2026-07-09T12:00:00Z"/>
         </w:trPr>
         <w:tc>
           <w:tcPr>
             <w:tcW w:type="dxa" w:w="3114"/>
           </w:tcPr>
           <w:p>
-            <w:ins w:id="1193" w:author="Colton Goodrich" w:date="2026-07-09T12:00:00Z">
+            <w:ins w:id="1030" w:author="Colton Goodrich" w:date="2026-07-09T12:00:00Z">
               <w:r>
                 <w:t xml:space="preserve">ICESat-2 elevation (external control)</w:t>
               </w:r>
@@ -2040,7 +1325,7 @@
             <w:tcW w:type="dxa" w:w="3129"/>
           </w:tcPr>
           <w:p>
-            <w:ins w:id="1194" w:author="Colton Goodrich" w:date="2026-07-09T12:00:00Z">
+            <w:ins w:id="1031" w:author="Colton Goodrich" w:date="2026-07-09T12:00:00Z">
               <w:r>
                 <w:t xml:space="preserve">NASA NSIDC DAAC</w:t>
               </w:r>
@@ -2052,7 +1337,7 @@
             <w:tcW w:type="dxa" w:w="3107"/>
           </w:tcPr>
           <w:p>
-            <w:ins w:id="1195" w:author="Colton Goodrich" w:date="2026-07-09T12:00:00Z">
+            <w:ins w:id="1032" w:author="Colton Goodrich" w:date="2026-07-09T12:00:00Z">
               <w:r>
                 <w:t xml:space="preserve">public, free</w:t>
               </w:r>
@@ -2078,108 +1363,14 @@
     </w:p>
     <w:p>
       <w:commentRangeStart w:id="97"/>
-      <w:r>
-        <w:t xml:space="preserve">A single workstation GPU trains the segmentation </w:t>
-      </w:r>
-      <w:del w:id="1115" w:author="Colton Goodrich" w:date="2026-07-09T12:00:00Z">
+      <w:del w:id="1019" w:author="Colton Goodrich" w:date="2026-07-09T12:00:00Z">
         <w:r>
-          <w:delText xml:space="preserve">models;</w:delText>
+          <w:delText xml:space="preserve">A single workstation GPU trains the segmentation models; the elevation processing is CPU-bound and modest. No supercomputer allocation is required. Full-valley raster stacks reach tens of gigabytes and need only local storage, not specialized infrastructure.</w:delText>
         </w:r>
       </w:del>
-      <w:ins w:id="1116" w:author="Colton Goodrich" w:date="2026-07-09T12:00:00Z">
+      <w:ins w:id="1020" w:author="Colton Goodrich" w:date="2026-07-09T12:00:00Z">
         <w:r>
-          <w:t xml:space="preserve">models, and</w:t>
-        </w:r>
-      </w:ins>
-      <w:r>
-        <w:t xml:space="preserve"> the elevation processing is CPU-bound and modest. </w:t>
-      </w:r>
-      <w:del w:id="1117" w:author="Colton Goodrich" w:date="2026-07-09T12:00:00Z">
-        <w:r>
-          <w:delText xml:space="preserve">No</w:delText>
-        </w:r>
-      </w:del>
-      <w:ins w:id="1118" w:author="Colton Goodrich" w:date="2026-07-09T12:00:00Z">
-        <w:r>
-          <w:t xml:space="preserve">Free</w:t>
-        </w:r>
-      </w:ins>
-      <w:r>
-        <w:t xml:space="preserve"> </w:t>
-      </w:r>
-      <w:del w:id="1119" w:author="Colton Goodrich" w:date="2026-07-09T12:00:00Z">
-        <w:r>
-          <w:delText xml:space="preserve">supercomputer</w:delText>
-        </w:r>
-      </w:del>
-      <w:ins w:id="1120" w:author="Colton Goodrich" w:date="2026-07-09T12:00:00Z">
-        <w:r>
-          <w:t xml:space="preserve">access</w:t>
-        </w:r>
-      </w:ins>
-      <w:r>
-        <w:t xml:space="preserve"> </w:t>
-      </w:r>
-      <w:del w:id="1121" w:author="Colton Goodrich" w:date="2026-07-09T12:00:00Z">
-        <w:r>
-          <w:delText xml:space="preserve">allocation</w:delText>
-        </w:r>
-      </w:del>
-      <w:ins w:id="1122" w:author="Colton Goodrich" w:date="2026-07-09T12:00:00Z">
-        <w:r>
-          <w:t xml:space="preserve">to the host institution's high-performance computing cluster</w:t>
-        </w:r>
-      </w:ins>
-      <w:r>
-        <w:t xml:space="preserve"> is </w:t>
-      </w:r>
-      <w:del w:id="1123" w:author="Colton Goodrich" w:date="2026-07-09T12:00:00Z">
-        <w:r>
-          <w:delText xml:space="preserve">required.</w:delText>
-        </w:r>
-      </w:del>
-      <w:ins w:id="1124" w:author="Colton Goodrich" w:date="2026-07-09T12:00:00Z">
-        <w:r>
-          <w:t xml:space="preserve">available</w:t>
-        </w:r>
-      </w:ins>
-      <w:r>
-        <w:t xml:space="preserve"> </w:t>
-      </w:r>
-      <w:del w:id="1125" w:author="Colton Goodrich" w:date="2026-07-09T12:00:00Z">
-        <w:r>
-          <w:delText xml:space="preserve">Full-valley</w:delText>
-        </w:r>
-      </w:del>
-      <w:ins w:id="1126" w:author="Colton Goodrich" w:date="2026-07-09T12:00:00Z">
-        <w:r>
-          <w:t xml:space="preserve">for</w:t>
-        </w:r>
-      </w:ins>
-      <w:r>
-        <w:t xml:space="preserve"> </w:t>
-      </w:r>
-      <w:del w:id="1127" w:author="Colton Goodrich" w:date="2026-07-09T12:00:00Z">
-        <w:r>
-          <w:delText xml:space="preserve">raster</w:delText>
-        </w:r>
-      </w:del>
-      <w:ins w:id="1128" w:author="Colton Goodrich" w:date="2026-07-09T12:00:00Z">
-        <w:r>
-          <w:t xml:space="preserve">any heavier batch processing, though the project does not depend on it. Raster</w:t>
-        </w:r>
-      </w:ins>
-      <w:r>
-        <w:t xml:space="preserve"> stacks reach tens of gigabytes and need only local </w:t>
-      </w:r>
-      <w:del w:id="1129" w:author="Colton Goodrich" w:date="2026-07-09T12:00:00Z">
-        <w:r>
-          <w:delText xml:space="preserve">storage, not specialized infrastructure.</w:delText>
-        </w:r>
-      </w:del>
-      <w:ins w:id="1130" w:author="Colton Goodrich" w:date="2026-07-09T12:00:00Z">
-        <w:r>
-          <w:t xml:space="preserve">storage.</w:t>
+          <w:t xml:space="preserve">A single workstation GPU trains the segmentation models, and the elevation processing is CPU-bound and modest. Free access to the host institution's high-performance computing cluster is available for any heavier batch processing, though the project does not depend on it. Raster stacks reach tens of gigabytes and need only local storage.</w:t>
         </w:r>
       </w:ins>
       <w:commentRangeEnd w:id="97"/>
@@ -2207,7 +1398,7 @@
       </w:r>
     </w:p>
     <w:p>
-      <w:del w:id="1131" w:author="Colton Goodrich" w:date="2026-07-09T12:00:00Z">
+      <w:del w:id="1021" w:author="Colton Goodrich" w:date="2026-07-09T12:00:00Z">
         <w:r>
           <w:rPr>
             <w:b/>
@@ -2216,7 +1407,7 @@
           <w:delText xml:space="preserve">Community Contact</w:delText>
         </w:r>
       </w:del>
-      <w:ins w:id="1132" w:author="Colton Goodrich" w:date="2026-07-09T12:00:00Z">
+      <w:ins w:id="1022" w:author="Colton Goodrich" w:date="2026-07-09T12:00:00Z">
         <w:r>
           <w:rPr>
             <w:b/>
@@ -2228,230 +1419,14 @@
     </w:p>
     <w:p>
       <w:commentRangeStart w:id="98"/>
-      <w:del w:id="1133" w:author="Colton Goodrich" w:date="2026-07-09T12:00:00Z">
+      <w:del w:id="1023" w:author="Colton Goodrich" w:date="2026-07-09T12:00:00Z">
         <w:r>
-          <w:delText xml:space="preserve">The</w:delText>
+          <w:delText xml:space="preserve">The dissertation author has been contacted and is responsive. Continued cooperation helps but is not vital: every analysis can proceed from public data.</w:delText>
         </w:r>
       </w:del>
-      <w:ins w:id="1134" w:author="Colton Goodrich" w:date="2026-07-09T12:00:00Z">
+      <w:ins w:id="1024" w:author="Colton Goodrich" w:date="2026-07-09T12:00:00Z">
         <w:r>
-          <w:t xml:space="preserve">Results</w:t>
-        </w:r>
-      </w:ins>
-      <w:r>
-        <w:t xml:space="preserve"> </w:t>
-      </w:r>
-      <w:del w:id="1135" w:author="Colton Goodrich" w:date="2026-07-09T12:00:00Z">
-        <w:r>
-          <w:delText xml:space="preserve">dissertation</w:delText>
-        </w:r>
-      </w:del>
-      <w:ins w:id="1136" w:author="Colton Goodrich" w:date="2026-07-09T12:00:00Z">
-        <w:r>
-          <w:t xml:space="preserve">will</w:t>
-        </w:r>
-      </w:ins>
-      <w:r>
-        <w:t xml:space="preserve"> </w:t>
-      </w:r>
-      <w:del w:id="1137" w:author="Colton Goodrich" w:date="2026-07-09T12:00:00Z">
-        <w:r>
-          <w:delText xml:space="preserve">author</w:delText>
-        </w:r>
-      </w:del>
-      <w:ins w:id="1138" w:author="Colton Goodrich" w:date="2026-07-09T12:00:00Z">
-        <w:r>
-          <w:t xml:space="preserve">reach</w:t>
-        </w:r>
-      </w:ins>
-      <w:r>
-        <w:t xml:space="preserve"> </w:t>
-      </w:r>
-      <w:del w:id="1139" w:author="Colton Goodrich" w:date="2026-07-09T12:00:00Z">
-        <w:r>
-          <w:delText xml:space="preserve">has</w:delText>
-        </w:r>
-      </w:del>
-      <w:ins w:id="1140" w:author="Colton Goodrich" w:date="2026-07-09T12:00:00Z">
-        <w:r>
-          <w:t xml:space="preserve">the</w:t>
-        </w:r>
-      </w:ins>
-      <w:r>
-        <w:t xml:space="preserve"> </w:t>
-      </w:r>
-      <w:del w:id="1141" w:author="Colton Goodrich" w:date="2026-07-09T12:00:00Z">
-        <w:r>
-          <w:delText xml:space="preserve">been</w:delText>
-        </w:r>
-      </w:del>
-      <w:ins w:id="1142" w:author="Colton Goodrich" w:date="2026-07-09T12:00:00Z">
-        <w:r>
-          <w:t xml:space="preserve">cryosphere</w:t>
-        </w:r>
-      </w:ins>
-      <w:r>
-        <w:t xml:space="preserve"> </w:t>
-      </w:r>
-      <w:del w:id="1143" w:author="Colton Goodrich" w:date="2026-07-09T12:00:00Z">
-        <w:r>
-          <w:delText xml:space="preserve">contacted</w:delText>
-        </w:r>
-      </w:del>
-      <w:ins w:id="1144" w:author="Colton Goodrich" w:date="2026-07-09T12:00:00Z">
-        <w:r>
-          <w:t xml:space="preserve">community through presentations at AGU</w:t>
-        </w:r>
-      </w:ins>
-      <w:r>
-        <w:t xml:space="preserve"> and </w:t>
-      </w:r>
-      <w:del w:id="1145" w:author="Colton Goodrich" w:date="2026-07-09T12:00:00Z">
-        <w:r>
-          <w:delText xml:space="preserve">is</w:delText>
-        </w:r>
-      </w:del>
-      <w:ins w:id="1146" w:author="Colton Goodrich" w:date="2026-07-09T12:00:00Z">
-        <w:r>
-          <w:t xml:space="preserve">polar-science</w:t>
-        </w:r>
-      </w:ins>
-      <w:r>
-        <w:t xml:space="preserve"> </w:t>
-      </w:r>
-      <w:del w:id="1147" w:author="Colton Goodrich" w:date="2026-07-09T12:00:00Z">
-        <w:r>
-          <w:delText xml:space="preserve">responsive.</w:delText>
-        </w:r>
-      </w:del>
-      <w:ins w:id="1148" w:author="Colton Goodrich" w:date="2026-07-09T12:00:00Z">
-        <w:r>
-          <w:t xml:space="preserve">meetings</w:t>
-        </w:r>
-      </w:ins>
-      <w:r>
-        <w:t xml:space="preserve"> </w:t>
-      </w:r>
-      <w:del w:id="1149" w:author="Colton Goodrich" w:date="2026-07-09T12:00:00Z">
-        <w:r>
-          <w:delText xml:space="preserve">Continued</w:delText>
-        </w:r>
-      </w:del>
-      <w:ins w:id="1150" w:author="Colton Goodrich" w:date="2026-07-09T12:00:00Z">
-        <w:r>
-          <w:t xml:space="preserve">and</w:t>
-        </w:r>
-      </w:ins>
-      <w:r>
-        <w:t xml:space="preserve"> </w:t>
-      </w:r>
-      <w:del w:id="1151" w:author="Colton Goodrich" w:date="2026-07-09T12:00:00Z">
-        <w:r>
-          <w:delText xml:space="preserve">cooperation</w:delText>
-        </w:r>
-      </w:del>
-      <w:ins w:id="1152" w:author="Colton Goodrich" w:date="2026-07-09T12:00:00Z">
-        <w:r>
-          <w:t xml:space="preserve">through</w:t>
-        </w:r>
-      </w:ins>
-      <w:r>
-        <w:t xml:space="preserve"> </w:t>
-      </w:r>
-      <w:del w:id="1153" w:author="Colton Goodrich" w:date="2026-07-09T12:00:00Z">
-        <w:r>
-          <w:delText xml:space="preserve">helps</w:delText>
-        </w:r>
-      </w:del>
-      <w:ins w:id="1154" w:author="Colton Goodrich" w:date="2026-07-09T12:00:00Z">
-        <w:r>
-          <w:t xml:space="preserve">open-access</w:t>
-        </w:r>
-      </w:ins>
-      <w:r>
-        <w:t xml:space="preserve"> </w:t>
-      </w:r>
-      <w:del w:id="1155" w:author="Colton Goodrich" w:date="2026-07-09T12:00:00Z">
-        <w:r>
-          <w:delText xml:space="preserve">but</w:delText>
-        </w:r>
-      </w:del>
-      <w:ins w:id="1156" w:author="Colton Goodrich" w:date="2026-07-09T12:00:00Z">
-        <w:r>
-          <w:t xml:space="preserve">publications</w:t>
-        </w:r>
-      </w:ins>
-      <w:r>
-        <w:t xml:space="preserve"> </w:t>
-      </w:r>
-      <w:del w:id="1157" w:author="Colton Goodrich" w:date="2026-07-09T12:00:00Z">
-        <w:r>
-          <w:delText xml:space="preserve">is</w:delText>
-        </w:r>
-      </w:del>
-      <w:ins w:id="1158" w:author="Colton Goodrich" w:date="2026-07-09T12:00:00Z">
-        <w:r>
-          <w:t xml:space="preserve">and</w:t>
-        </w:r>
-      </w:ins>
-      <w:r>
-        <w:t xml:space="preserve"> </w:t>
-      </w:r>
-      <w:del w:id="1159" w:author="Colton Goodrich" w:date="2026-07-09T12:00:00Z">
-        <w:r>
-          <w:delText xml:space="preserve">not</w:delText>
-        </w:r>
-      </w:del>
-      <w:ins w:id="1160" w:author="Colton Goodrich" w:date="2026-07-09T12:00:00Z">
-        <w:r>
-          <w:t xml:space="preserve">archived</w:t>
-        </w:r>
-      </w:ins>
-      <w:r>
-        <w:t xml:space="preserve"> </w:t>
-      </w:r>
-      <w:del w:id="1161" w:author="Colton Goodrich" w:date="2026-07-09T12:00:00Z">
-        <w:r>
-          <w:delText xml:space="preserve">vital:</w:delText>
-        </w:r>
-      </w:del>
-      <w:ins w:id="1162" w:author="Colton Goodrich" w:date="2026-07-09T12:00:00Z">
-        <w:r>
-          <w:t xml:space="preserve">data</w:t>
-        </w:r>
-      </w:ins>
-      <w:r>
-        <w:t xml:space="preserve"> </w:t>
-      </w:r>
-      <w:del w:id="1163" w:author="Colton Goodrich" w:date="2026-07-09T12:00:00Z">
-        <w:r>
-          <w:delText xml:space="preserve">every</w:delText>
-        </w:r>
-      </w:del>
-      <w:ins w:id="1164" w:author="Colton Goodrich" w:date="2026-07-09T12:00:00Z">
-        <w:r>
-          <w:t xml:space="preserve">products with DOIs. Because the</w:t>
-        </w:r>
-      </w:ins>
-      <w:r>
-        <w:t xml:space="preserve"> analysis</w:t>
-      </w:r>
-      <w:ins w:id="1165" w:author="Colton Goodrich" w:date="2026-07-09T12:00:00Z">
-        <w:r>
-          <w:t xml:space="preserve"> relies only on public data, it</w:t>
-        </w:r>
-      </w:ins>
-      <w:r>
-        <w:t xml:space="preserve"> can proceed </w:t>
-      </w:r>
-      <w:del w:id="1166" w:author="Colton Goodrich" w:date="2026-07-09T12:00:00Z">
-        <w:r>
-          <w:delText xml:space="preserve">from public data.</w:delText>
-        </w:r>
-      </w:del>
-      <w:ins w:id="1167" w:author="Colton Goodrich" w:date="2026-07-09T12:00:00Z">
-        <w:r>
-          <w:t xml:space="preserve">independently.</w:t>
+          <w:t xml:space="preserve">Results will reach the cryosphere community through presentations at AGU and polar-science meetings and through open-access publications and archived data products with DOIs. Because the analysis relies only on public data, it can proceed independently.</w:t>
         </w:r>
       </w:ins>
       <w:commentRangeEnd w:id="98"/>
@@ -2535,121 +1510,14 @@
       </w:r>
     </w:p>
     <w:p>
-      <w:r>
-        <w:t xml:space="preserve">Outside the channels, change may be too small to detect. The valley floors change slowly, so much of the surface may sit below our detection threshold. If so, objective 2 </w:t>
-      </w:r>
-      <w:del w:id="1168" w:author="Colton Goodrich" w:date="2026-07-09T12:00:00Z">
+      <w:del w:id="1025" w:author="Colton Goodrich" w:date="2026-07-09T12:00:00Z">
         <w:r>
-          <w:delText xml:space="preserve">narrows</w:delText>
+          <w:delText xml:space="preserve">Outside the channels, change may be too small to detect. The valley floors change slowly, so much of the surface may sit below our detection threshold. If so, objective 2 narrows back to in-channel change and the landscape-wide result is reported accordingly.</w:delText>
         </w:r>
       </w:del>
-      <w:ins w:id="1169" w:author="Colton Goodrich" w:date="2026-07-09T12:00:00Z">
+      <w:ins w:id="1026" w:author="Colton Goodrich" w:date="2026-07-09T12:00:00Z">
         <w:r>
-          <w:t xml:space="preserve">stays</w:t>
-        </w:r>
-      </w:ins>
-      <w:r>
-        <w:t xml:space="preserve"> </w:t>
-      </w:r>
-      <w:del w:id="1170" w:author="Colton Goodrich" w:date="2026-07-09T12:00:00Z">
-        <w:r>
-          <w:delText xml:space="preserve">back</w:delText>
-        </w:r>
-      </w:del>
-      <w:ins w:id="1171" w:author="Colton Goodrich" w:date="2026-07-09T12:00:00Z">
-        <w:r>
-          <w:t xml:space="preserve">tight</w:t>
-        </w:r>
-      </w:ins>
-      <w:r>
-        <w:t xml:space="preserve"> to </w:t>
-      </w:r>
-      <w:del w:id="1172" w:author="Colton Goodrich" w:date="2026-07-09T12:00:00Z">
-        <w:r>
-          <w:delText xml:space="preserve">in-channel</w:delText>
-        </w:r>
-      </w:del>
-      <w:ins w:id="1173" w:author="Colton Goodrich" w:date="2026-07-09T12:00:00Z">
-        <w:r>
-          <w:t xml:space="preserve">the</w:t>
-        </w:r>
-      </w:ins>
-      <w:r>
-        <w:t xml:space="preserve"> </w:t>
-      </w:r>
-      <w:del w:id="1174" w:author="Colton Goodrich" w:date="2026-07-09T12:00:00Z">
-        <w:r>
-          <w:delText xml:space="preserve">change</w:delText>
-        </w:r>
-      </w:del>
-      <w:ins w:id="1175" w:author="Colton Goodrich" w:date="2026-07-09T12:00:00Z">
-        <w:r>
-          <w:t xml:space="preserve">channel</w:t>
-        </w:r>
-      </w:ins>
-      <w:r>
-        <w:t xml:space="preserve"> and </w:t>
-      </w:r>
-      <w:del w:id="1176" w:author="Colton Goodrich" w:date="2026-07-09T12:00:00Z">
-        <w:r>
-          <w:delText xml:space="preserve">the</w:delText>
-        </w:r>
-      </w:del>
-      <w:ins w:id="1177" w:author="Colton Goodrich" w:date="2026-07-09T12:00:00Z">
-        <w:r>
-          <w:t xml:space="preserve">its</w:t>
-        </w:r>
-      </w:ins>
-      <w:r>
-        <w:t xml:space="preserve"> </w:t>
-      </w:r>
-      <w:del w:id="1178" w:author="Colton Goodrich" w:date="2026-07-09T12:00:00Z">
-        <w:r>
-          <w:delText xml:space="preserve">landscape-wide</w:delText>
-        </w:r>
-      </w:del>
-      <w:ins w:id="1179" w:author="Colton Goodrich" w:date="2026-07-09T12:00:00Z">
-        <w:r>
-          <w:t xml:space="preserve">immediate</w:t>
-        </w:r>
-      </w:ins>
-      <w:r>
-        <w:t xml:space="preserve"> </w:t>
-      </w:r>
-      <w:del w:id="1180" w:author="Colton Goodrich" w:date="2026-07-09T12:00:00Z">
-        <w:r>
-          <w:delText xml:space="preserve">result</w:delText>
-        </w:r>
-      </w:del>
-      <w:ins w:id="1181" w:author="Colton Goodrich" w:date="2026-07-09T12:00:00Z">
-        <w:r>
-          <w:t xml:space="preserve">margins,</w:t>
-        </w:r>
-      </w:ins>
-      <w:r>
-        <w:t xml:space="preserve"> </w:t>
-      </w:r>
-      <w:del w:id="1182" w:author="Colton Goodrich" w:date="2026-07-09T12:00:00Z">
-        <w:r>
-          <w:delText xml:space="preserve">is</w:delText>
-        </w:r>
-      </w:del>
-      <w:ins w:id="1183" w:author="Colton Goodrich" w:date="2026-07-09T12:00:00Z">
-        <w:r>
-          <w:t xml:space="preserve">and results are</w:t>
-        </w:r>
-      </w:ins>
-      <w:r>
-        <w:t xml:space="preserve"> reported </w:t>
-      </w:r>
-      <w:del w:id="1184" w:author="Colton Goodrich" w:date="2026-07-09T12:00:00Z">
-        <w:r>
-          <w:delText xml:space="preserve">accordingly.</w:delText>
-        </w:r>
-      </w:del>
-      <w:ins w:id="1185" w:author="Colton Goodrich" w:date="2026-07-09T12:00:00Z">
-        <w:r>
-          <w:t xml:space="preserve">at that scope.</w:t>
+          <w:t xml:space="preserve">Outside the channels, change may be too small to detect. The valley floors change slowly, so much of the surface may sit below our detection threshold. If so, objective 2 stays tight to the channel and its immediate margins, and results are reported at that scope.</w:t>
         </w:r>
       </w:ins>
     </w:p>
@@ -2828,81 +1696,24 @@
             <w:pPr>
               <w:spacing w:after="20"/>
             </w:pPr>
-            <w:del w:id="1186" w:author="Colton Goodrich" w:date="2026-07-09T12:00:00Z">
+            <w:del w:id="1027" w:author="Colton Goodrich" w:date="2026-07-09T12:00:00Z">
               <w:r>
                 <w:rPr>
                   <w:rFonts w:ascii="Calibri" w:hAnsi="Calibri"/>
                   <w:sz w:val="18"/>
                 </w:rPr>
-                <w:delText xml:space="preserve">Landscape-wide</w:delText>
+                <w:delText xml:space="preserve">Landscape-wide change detection + process-type classification (O2), gated by the O3 thresholds; driver tests per change type; sensor-disagreement correction</w:delText>
               </w:r>
             </w:del>
-            <w:ins w:id="1187" w:author="Colton Goodrich" w:date="2026-07-09T12:00:00Z">
+            <w:ins w:id="1028" w:author="Colton Goodrich" w:date="2026-07-09T12:00:00Z">
               <w:r>
                 <w:rPr>
                   <w:rFonts w:ascii="Calibri" w:hAnsi="Calibri"/>
                   <w:sz w:val="18"/>
                 </w:rPr>
-                <w:t xml:space="preserve">Stream-corridor</w:t>
+                <w:t xml:space="preserve">Stream-corridor process attribution (O2), gated by the O3 thresholds; driver tests per change type; sensor-disagreement correction</w:t>
               </w:r>
             </w:ins>
-            <w:r>
-              <w:rPr>
-                <w:rFonts w:ascii="Calibri" w:hAnsi="Calibri"/>
-                <w:sz w:val="18"/>
-              </w:rPr>
-              <w:t xml:space="preserve"> </w:t>
-            </w:r>
-            <w:del w:id="1188" w:author="Colton Goodrich" w:date="2026-07-09T12:00:00Z">
-              <w:r>
-                <w:rPr>
-                  <w:rFonts w:ascii="Calibri" w:hAnsi="Calibri"/>
-                  <w:sz w:val="18"/>
-                </w:rPr>
-                <w:delText xml:space="preserve">change</w:delText>
-              </w:r>
-            </w:del>
-            <w:ins w:id="1189" w:author="Colton Goodrich" w:date="2026-07-09T12:00:00Z">
-              <w:r>
-                <w:rPr>
-                  <w:rFonts w:ascii="Calibri" w:hAnsi="Calibri"/>
-                  <w:sz w:val="18"/>
-                </w:rPr>
-                <w:t xml:space="preserve">process</w:t>
-              </w:r>
-            </w:ins>
-            <w:r>
-              <w:rPr>
-                <w:rFonts w:ascii="Calibri" w:hAnsi="Calibri"/>
-                <w:sz w:val="18"/>
-              </w:rPr>
-              <w:t xml:space="preserve"> </w:t>
-            </w:r>
-            <w:del w:id="1190" w:author="Colton Goodrich" w:date="2026-07-09T12:00:00Z">
-              <w:r>
-                <w:rPr>
-                  <w:rFonts w:ascii="Calibri" w:hAnsi="Calibri"/>
-                  <w:sz w:val="18"/>
-                </w:rPr>
-                <w:delText xml:space="preserve">detection + process-type classification</w:delText>
-              </w:r>
-            </w:del>
-            <w:ins w:id="1191" w:author="Colton Goodrich" w:date="2026-07-09T12:00:00Z">
-              <w:r>
-                <w:rPr>
-                  <w:rFonts w:ascii="Calibri" w:hAnsi="Calibri"/>
-                  <w:sz w:val="18"/>
-                </w:rPr>
-                <w:t xml:space="preserve">attribution</w:t>
-              </w:r>
-            </w:ins>
-            <w:r>
-              <w:rPr>
-                <w:rFonts w:ascii="Calibri" w:hAnsi="Calibri"/>
-                <w:sz w:val="18"/>
-              </w:rPr>
-              <w:t xml:space="preserve"> (O2), gated by the O3 thresholds; driver tests per change type; sensor-disagreement correction</w:t>
-            </w:r>
           </w:p>
         </w:tc>
         <w:tc>

</xml_diff>

<commit_message>
barlow/finesst: tracked changes at sentence granularity (natural human edits)
Diff per sentence, not per word or per whole paragraph: only the changed
sentence(s) are struck/replaced, unchanged sentences left intact; a fully
rewritten paragraph still comes through as one block. Reads like a person
revised specific sentences. Comments preserved; accept-all still == clean v8.

Co-Authored-By: Claude Opus 4.8 (1M context) <noreply@anthropic.com>
</commit_message>
<xml_diff>
--- a/barlow/docs/finesst_proposal_v8_tracked.docx
+++ b/barlow/docs/finesst_proposal_v8_tracked.docx
@@ -18,14 +18,17 @@
       </w:r>
     </w:p>
     <w:p>
+      <w:r>
+        <w:t xml:space="preserve">Summary: Previous work [1] has identified places where Antarctic Dry Valley streams are reshaping the land, but it stops at location and doesn’t examine the causes of stream migration. This project attempts to elucidate the drivers of channel migration. </w:t>
+      </w:r>
       <w:del w:id="1001" w:author="Colton Goodrich" w:date="2026-07-09T12:00:00Z">
         <w:r>
-          <w:delText xml:space="preserve">Summary: Previous work [1] has identified places where Antarctic Dry Valley streams are reshaping the land, but it stops at location and doesn’t examine the causes of stream migration. This project attempts to elucidate the drivers of channel migration. Using remote sensing and machine learning, it links the measured changes to the driving processes (heat, melt, thawing ground), widens the measurement from the stream channels to the whole valley floor, and attaches a real uncertainty value to every pixel.</w:delText>
+          <w:delText xml:space="preserve">Using remote sensing and machine learning, it links the measured changes to the driving processes (heat, melt, thawing ground), widens the measurement from the stream channels to the whole valley floor, and attaches a real uncertainty value to every pixel.</w:delText>
         </w:r>
       </w:del>
       <w:ins w:id="1002" w:author="Colton Goodrich" w:date="2026-07-09T12:00:00Z">
         <w:r>
-          <w:t xml:space="preserve">Summary: Previous work [1] has identified places where Antarctic Dry Valley streams are reshaping the land, but it stops at location and doesn’t examine the causes of stream migration. This project attempts to elucidate the drivers of channel migration. Using remote sensing and machine learning, it links the measured changes to the driving processes (heat, melt, thawing ground), extends the measurement from the channel centerline into the near-channel corridor, and attaches a real uncertainty value to every pixel.</w:t>
+          <w:t xml:space="preserve">Using remote sensing and machine learning, it links the measured changes to the driving processes (heat, melt, thawing ground), extends the measurement from the channel centerline into the near-channel corridor, and attaches a real uncertainty value to every pixel.</w:t>
         </w:r>
       </w:ins>
       <w:r/>
@@ -383,16 +386,22 @@
           <w:numId w:val="3"/>
         </w:numPr>
       </w:pPr>
+      <w:r>
+        <w:t xml:space="preserve">Attribution. Determination of  which climate drivers control each stream's rate of geomorphic change. </w:t>
+      </w:r>
       <w:del w:id="1007" w:author="Colton Goodrich" w:date="2026-07-09T12:00:00Z">
         <w:r>
-          <w:delText xml:space="preserve">Attribution. Determination of  which climate drivers control each stream's rate of geomorphic change. Candidate drivers include: air temperature, incoming sunlight, meltwater discharge, glacial mass, and summer thaw. We hypothesize that melt energy will predict sediment movement better than water volume alone. The hypothesis is testable: if discharge alone correlates with channel migration rate then the hypothesis fails.</w:delText>
+          <w:delText xml:space="preserve">Candidate drivers include: air temperature, incoming sunlight, meltwater discharge, glacial mass, and summer thaw. </w:delText>
         </w:r>
       </w:del>
       <w:ins w:id="1008" w:author="Colton Goodrich" w:date="2026-07-09T12:00:00Z">
         <w:r>
-          <w:t xml:space="preserve">Attribution. Determination of  which climate drivers control each stream's rate of geomorphic change. Candidate drivers — drawn from MDV-LTER station records [6] and the ERA5 reanalysis [7] — are air temperature, incoming sunlight, meltwater discharge, glacial mass balance, and summer thaw. We hypothesize that melt energy will predict sediment movement better than water volume alone. The hypothesis is testable: if discharge alone correlates with channel migration rate then the hypothesis fails.</w:t>
+          <w:t xml:space="preserve">Candidate drivers — drawn from MDV-LTER station records [6] and the ERA5 reanalysis [7] — are air temperature, incoming sunlight, meltwater discharge, glacial mass balance, and summer thaw. </w:t>
         </w:r>
       </w:ins>
+      <w:r>
+        <w:t xml:space="preserve">We hypothesize that melt energy will predict sediment movement better than water volume alone. The hypothesis is testable: if discharge alone correlates with channel migration rate then the hypothesis fails.</w:t>
+      </w:r>
       <w:commentRangeStart w:id="80"/>
       <w:commentRangeEnd w:id="80"/>
       <w:r>
@@ -451,16 +460,22 @@
         </w:numPr>
       </w:pPr>
       <w:commentRangeStart w:id="93"/>
+      <w:r>
+        <w:t xml:space="preserve">Calibrated uncertainty. </w:t>
+      </w:r>
       <w:del w:id="1011" w:author="Colton Goodrich" w:date="2026-07-09T12:00:00Z">
         <w:r>
-          <w:delText xml:space="preserve">Calibrated uncertainty. Replace the dissertation's single valley-wide noise estimate with a per-pixel detection threshold for slope, aspect, and sensor. Success test: on ground that did not change, a 95% confidence threshold should be exceeded by 5% of pixels.</w:delText>
+          <w:delText xml:space="preserve">Replace the dissertation's single valley-wide noise estimate with a per-pixel detection threshold for slope, aspect, and sensor. </w:delText>
         </w:r>
       </w:del>
       <w:ins w:id="1012" w:author="Colton Goodrich" w:date="2026-07-09T12:00:00Z">
         <w:r>
-          <w:t xml:space="preserve">Calibrated uncertainty. Provide a per-pixel detection threshold for slope, aspect, and sensor, in place of a single valley-wide noise value. Success test: on ground that did not change, a 95% confidence threshold should be exceeded by 5% of pixels.</w:t>
+          <w:t xml:space="preserve">Provide a per-pixel detection threshold for slope, aspect, and sensor, in place of a single valley-wide noise value. </w:t>
         </w:r>
       </w:ins>
+      <w:r>
+        <w:t xml:space="preserve">Success test: on ground that did not change, a 95% confidence threshold should be exceeded by 5% of pixels.</w:t>
+      </w:r>
       <w:commentRangeEnd w:id="93"/>
       <w:r>
         <w:rPr>
@@ -540,6 +555,14 @@
         <w:jc w:val="center"/>
       </w:pPr>
       <w:commentRangeStart w:id="94"/>
+      <w:r>
+        <w:rPr>
+          <w:i/>
+          <w:color w:val="404040"/>
+          <w:sz w:val="18"/>
+        </w:rPr>
+        <w:t xml:space="preserve">Figure 2. </w:t>
+      </w:r>
       <w:del w:id="1013" w:author="Colton Goodrich" w:date="2026-07-09T12:00:00Z">
         <w:r>
           <w:rPr>
@@ -547,7 +570,7 @@
             <w:color w:val="404040"/>
             <w:sz w:val="18"/>
           </w:rPr>
-          <w:delText xml:space="preserve">Figure 2. Planned detection-to-attribution workflow: three DEM epochs, co-registration, DEM-of-Difference, per-pixel detection floor, then the O1 (channel), O2 (valley-floor), and O3 (uncertainty) objectives. Method schematic; no results shown.</w:delText>
+          <w:delText xml:space="preserve">Planned detection-to-attribution workflow: three DEM epochs, co-registration, DEM-of-Difference, per-pixel detection floor, then the O1 (channel), O2 (valley-floor), and O3 (uncertainty) objectives. </w:delText>
         </w:r>
       </w:del>
       <w:ins w:id="1014" w:author="Colton Goodrich" w:date="2026-07-09T12:00:00Z">
@@ -557,9 +580,17 @@
             <w:color w:val="404040"/>
             <w:sz w:val="18"/>
           </w:rPr>
-          <w:t xml:space="preserve">Figure 2. Planned detection-to-attribution workflow: three DEM epochs, co-registration to airborne-lidar and ICESat-2 control, DEM-of-Difference, per-pixel detection floor, then the O1 (channel), O2 (stream-corridor), and O3 (uncertainty) objectives. Method schematic; no results shown.</w:t>
+          <w:t xml:space="preserve">Planned detection-to-attribution workflow: three DEM epochs, co-registration to airborne-lidar and ICESat-2 control, DEM-of-Difference, per-pixel detection floor, then the O1 (channel), O2 (stream-corridor), and O3 (uncertainty) objectives. </w:t>
         </w:r>
       </w:ins>
+      <w:r>
+        <w:rPr>
+          <w:i/>
+          <w:color w:val="404040"/>
+          <w:sz w:val="18"/>
+        </w:rPr>
+        <w:t xml:space="preserve">Method schematic; no results shown.</w:t>
+      </w:r>
       <w:commentRangeEnd w:id="94"/>
       <w:r>
         <w:rPr>
@@ -1510,14 +1541,17 @@
       </w:r>
     </w:p>
     <w:p>
+      <w:r>
+        <w:t xml:space="preserve">Outside the channels, change may be too small to detect. The valley floors change slowly, so much of the surface may sit below our detection threshold. </w:t>
+      </w:r>
       <w:del w:id="1025" w:author="Colton Goodrich" w:date="2026-07-09T12:00:00Z">
         <w:r>
-          <w:delText xml:space="preserve">Outside the channels, change may be too small to detect. The valley floors change slowly, so much of the surface may sit below our detection threshold. If so, objective 2 narrows back to in-channel change and the landscape-wide result is reported accordingly.</w:delText>
+          <w:delText xml:space="preserve">If so, objective 2 narrows back to in-channel change and the landscape-wide result is reported accordingly.</w:delText>
         </w:r>
       </w:del>
       <w:ins w:id="1026" w:author="Colton Goodrich" w:date="2026-07-09T12:00:00Z">
         <w:r>
-          <w:t xml:space="preserve">Outside the channels, change may be too small to detect. The valley floors change slowly, so much of the surface may sit below our detection threshold. If so, objective 2 stays tight to the channel and its immediate margins, and results are reported at that scope.</w:t>
+          <w:t xml:space="preserve">If so, objective 2 stays tight to the channel and its immediate margins, and results are reported at that scope.</w:t>
         </w:r>
       </w:ins>
     </w:p>

</xml_diff>

<commit_message>
barlow/finesst: tracked changes as minimal in-sentence spans (expert markup)
Diff within sentences: mark only the changed span, keep unchanged head/tail plain,
and coalesce tiny shared words (<10 non-ws chars between two changes) so it doesn't
fragment into word-by-word confetti. Fully rewritten sentences still collapse to one
block. Reads like a careful human edit. Comments preserved; accept-all == clean v8.

Co-Authored-By: Claude Opus 4.8 (1M context) <noreply@anthropic.com>
</commit_message>
<xml_diff>
--- a/barlow/docs/finesst_proposal_v8_tracked.docx
+++ b/barlow/docs/finesst_proposal_v8_tracked.docx
@@ -19,18 +19,34 @@
     </w:p>
     <w:p>
       <w:r>
-        <w:t xml:space="preserve">Summary: Previous work [1] has identified places where Antarctic Dry Valley streams are reshaping the land, but it stops at location and doesn’t examine the causes of stream migration. This project attempts to elucidate the drivers of channel migration. </w:t>
+        <w:t xml:space="preserve">Summary: Previous work [1] has identified places where Antarctic Dry Valley streams are reshaping the land, but it stops at location and doesn’t examine the causes of stream migration. This project attempts to elucidate the drivers of channel migration. Using remote sensing and machine learning, it links the measured changes to the driving processes (heat, melt, thawing ground), </w:t>
       </w:r>
       <w:del w:id="1001" w:author="Colton Goodrich" w:date="2026-07-09T12:00:00Z">
         <w:r>
-          <w:delText xml:space="preserve">Using remote sensing and machine learning, it links the measured changes to the driving processes (heat, melt, thawing ground), widens the measurement from the stream channels to the whole valley floor, and attaches a real uncertainty value to every pixel.</w:delText>
+          <w:delText xml:space="preserve">widens</w:delText>
         </w:r>
       </w:del>
       <w:ins w:id="1002" w:author="Colton Goodrich" w:date="2026-07-09T12:00:00Z">
         <w:r>
-          <w:t xml:space="preserve">Using remote sensing and machine learning, it links the measured changes to the driving processes (heat, melt, thawing ground), extends the measurement from the channel centerline into the near-channel corridor, and attaches a real uncertainty value to every pixel.</w:t>
+          <w:t xml:space="preserve">extends</w:t>
         </w:r>
       </w:ins>
+      <w:r>
+        <w:t xml:space="preserve"> the measurement from the </w:t>
+      </w:r>
+      <w:del w:id="1003" w:author="Colton Goodrich" w:date="2026-07-09T12:00:00Z">
+        <w:r>
+          <w:delText xml:space="preserve">stream channels to the whole valley floor,</w:delText>
+        </w:r>
+      </w:del>
+      <w:ins w:id="1004" w:author="Colton Goodrich" w:date="2026-07-09T12:00:00Z">
+        <w:r>
+          <w:t xml:space="preserve">channel centerline into the near-channel corridor,</w:t>
+        </w:r>
+      </w:ins>
+      <w:r>
+        <w:t xml:space="preserve"> and attaches a real uncertainty value to every pixel.</w:t>
+      </w:r>
       <w:r/>
       <w:r/>
       <w:r/>
@@ -257,7 +273,7 @@
           <w:b/>
         </w:rPr>
       </w:pPr>
-      <w:del w:id="1003" w:author="Colton Goodrich" w:date="2026-07-09T12:00:00Z">
+      <w:del w:id="1005" w:author="Colton Goodrich" w:date="2026-07-09T12:00:00Z">
         <w:r>
           <w:rPr>
             <w:b/>
@@ -266,7 +282,7 @@
           <w:delText xml:space="preserve">Current Data Deficiencies</w:delText>
         </w:r>
       </w:del>
-      <w:ins w:id="1004" w:author="Colton Goodrich" w:date="2026-07-09T12:00:00Z">
+      <w:ins w:id="1006" w:author="Colton Goodrich" w:date="2026-07-09T12:00:00Z">
         <w:r>
           <w:rPr>
             <w:b/>
@@ -282,12 +298,12 @@
           <w:b/>
         </w:rPr>
       </w:pPr>
-      <w:del w:id="1005" w:author="Colton Goodrich" w:date="2026-07-09T12:00:00Z">
+      <w:del w:id="1007" w:author="Colton Goodrich" w:date="2026-07-09T12:00:00Z">
         <w:r>
           <w:delText xml:space="preserve">The current state of the art as given in the dissertation is descriptive: it identifies where change happens but does not answer the larger question of why — what are the primary driving factor(s)? Because that work was masked to the stream channels, everything the elevation differencing measured outside them (thawing ground, fans) was set aside. This proposal completes it.</w:delText>
         </w:r>
       </w:del>
-      <w:ins w:id="1006" w:author="Colton Goodrich" w:date="2026-07-09T12:00:00Z">
+      <w:ins w:id="1008" w:author="Colton Goodrich" w:date="2026-07-09T12:00:00Z">
         <w:r>
           <w:t xml:space="preserve">Detecting where channels change is now feasible; explaining why is not. The open question is which climate drivers set the rate of channel change, and whether melt energy or water volume dominates. This project attributes measured stream-channel change to those drivers and attaches calibrated per-pixel uncertainty to every measurement.</w:t>
         </w:r>
@@ -387,20 +403,33 @@
         </w:numPr>
       </w:pPr>
       <w:r>
-        <w:t xml:space="preserve">Attribution. Determination of  which climate drivers control each stream's rate of geomorphic change. </w:t>
-      </w:r>
-      <w:del w:id="1007" w:author="Colton Goodrich" w:date="2026-07-09T12:00:00Z">
-        <w:r>
-          <w:delText xml:space="preserve">Candidate drivers include: air temperature, incoming sunlight, meltwater discharge, glacial mass, and summer thaw. </w:delText>
+        <w:t xml:space="preserve">Attribution. Determination of  which climate drivers control each stream's rate of geomorphic change. Candidate drivers </w:t>
+      </w:r>
+      <w:del w:id="1009" w:author="Colton Goodrich" w:date="2026-07-09T12:00:00Z">
+        <w:r>
+          <w:delText xml:space="preserve">include:</w:delText>
         </w:r>
       </w:del>
-      <w:ins w:id="1008" w:author="Colton Goodrich" w:date="2026-07-09T12:00:00Z">
-        <w:r>
-          <w:t xml:space="preserve">Candidate drivers — drawn from MDV-LTER station records [6] and the ERA5 reanalysis [7] — are air temperature, incoming sunlight, meltwater discharge, glacial mass balance, and summer thaw. </w:t>
+      <w:ins w:id="1010" w:author="Colton Goodrich" w:date="2026-07-09T12:00:00Z">
+        <w:r>
+          <w:t xml:space="preserve">— drawn from MDV-LTER station records [6] and the ERA5 reanalysis [7] — are</w:t>
         </w:r>
       </w:ins>
       <w:r>
-        <w:t xml:space="preserve">We hypothesize that melt energy will predict sediment movement better than water volume alone. The hypothesis is testable: if discharge alone correlates with channel migration rate then the hypothesis fails.</w:t>
+        <w:t xml:space="preserve"> air temperature, incoming sunlight, meltwater discharge, glacial </w:t>
+      </w:r>
+      <w:del w:id="1011" w:author="Colton Goodrich" w:date="2026-07-09T12:00:00Z">
+        <w:r>
+          <w:delText xml:space="preserve">mass,</w:delText>
+        </w:r>
+      </w:del>
+      <w:ins w:id="1012" w:author="Colton Goodrich" w:date="2026-07-09T12:00:00Z">
+        <w:r>
+          <w:t xml:space="preserve">mass balance,</w:t>
+        </w:r>
+      </w:ins>
+      <w:r>
+        <w:t xml:space="preserve"> and summer thaw. We hypothesize that melt energy will predict sediment movement better than water volume alone. The hypothesis is testable: if discharge alone correlates with channel migration rate then the hypothesis fails.</w:t>
       </w:r>
       <w:commentRangeStart w:id="80"/>
       <w:commentRangeEnd w:id="80"/>
@@ -422,14 +451,40 @@
         </w:numPr>
       </w:pPr>
       <w:commentRangeStart w:id="92"/>
-      <w:del w:id="1009" w:author="Colton Goodrich" w:date="2026-07-09T12:00:00Z">
-        <w:r>
-          <w:delText xml:space="preserve">Landscape-wide geomorphic change. Extend the measurement from the stream channels to the whole valley floor, and classify each patch of change by process: channel shift or avulsion, thaw subsidence, slope movement, fan growth, and lake-margin change.</w:delText>
+      <w:del w:id="1013" w:author="Colton Goodrich" w:date="2026-07-09T12:00:00Z">
+        <w:r>
+          <w:delText xml:space="preserve">Landscape-wide geomorphic change. Extend the measurement from the stream channels to the whole valley floor, and classify each patch of change by process:</w:delText>
         </w:r>
       </w:del>
-      <w:ins w:id="1010" w:author="Colton Goodrich" w:date="2026-07-09T12:00:00Z">
-        <w:r>
-          <w:t xml:space="preserve">Process attribution along the stream corridor. Beyond the channel centerline, classify change in the near-channel corridor — channel shift and avulsion, bank thaw and subsidence, and fan growth — by process type. Bedrock and stable soils outside the corridor provide the fixed control needed to co-register the sensors, so every change is measured against genuinely stable ground.</w:t>
+      <w:ins w:id="1014" w:author="Colton Goodrich" w:date="2026-07-09T12:00:00Z">
+        <w:r>
+          <w:t xml:space="preserve">Process attribution along the stream corridor. Beyond the channel centerline, classify change in the near-channel corridor —</w:t>
+        </w:r>
+      </w:ins>
+      <w:r>
+        <w:t xml:space="preserve"> channel shift </w:t>
+      </w:r>
+      <w:del w:id="1015" w:author="Colton Goodrich" w:date="2026-07-09T12:00:00Z">
+        <w:r>
+          <w:delText xml:space="preserve">or avulsion, thaw</w:delText>
+        </w:r>
+      </w:del>
+      <w:ins w:id="1016" w:author="Colton Goodrich" w:date="2026-07-09T12:00:00Z">
+        <w:r>
+          <w:t xml:space="preserve">and avulsion, bank thaw and</w:t>
+        </w:r>
+      </w:ins>
+      <w:r>
+        <w:t xml:space="preserve"> subsidence, </w:t>
+      </w:r>
+      <w:del w:id="1017" w:author="Colton Goodrich" w:date="2026-07-09T12:00:00Z">
+        <w:r>
+          <w:delText xml:space="preserve">slope movement, fan growth, and lake-margin change.</w:delText>
+        </w:r>
+      </w:del>
+      <w:ins w:id="1018" w:author="Colton Goodrich" w:date="2026-07-09T12:00:00Z">
+        <w:r>
+          <w:t xml:space="preserve">and fan growth — by process type. Bedrock and stable soils outside the corridor provide the fixed control needed to co-register the sensors, so every change is measured against genuinely stable ground.</w:t>
         </w:r>
       </w:ins>
       <w:commentRangeEnd w:id="92"/>
@@ -463,18 +518,31 @@
       <w:r>
         <w:t xml:space="preserve">Calibrated uncertainty. </w:t>
       </w:r>
-      <w:del w:id="1011" w:author="Colton Goodrich" w:date="2026-07-09T12:00:00Z">
-        <w:r>
-          <w:delText xml:space="preserve">Replace the dissertation's single valley-wide noise estimate with a per-pixel detection threshold for slope, aspect, and sensor. </w:delText>
+      <w:del w:id="1019" w:author="Colton Goodrich" w:date="2026-07-09T12:00:00Z">
+        <w:r>
+          <w:delText xml:space="preserve">Replace the dissertation's single valley-wide noise estimate with</w:delText>
         </w:r>
       </w:del>
-      <w:ins w:id="1012" w:author="Colton Goodrich" w:date="2026-07-09T12:00:00Z">
-        <w:r>
-          <w:t xml:space="preserve">Provide a per-pixel detection threshold for slope, aspect, and sensor, in place of a single valley-wide noise value. </w:t>
+      <w:ins w:id="1020" w:author="Colton Goodrich" w:date="2026-07-09T12:00:00Z">
+        <w:r>
+          <w:t xml:space="preserve">Provide</w:t>
         </w:r>
       </w:ins>
       <w:r>
-        <w:t xml:space="preserve">Success test: on ground that did not change, a 95% confidence threshold should be exceeded by 5% of pixels.</w:t>
+        <w:t xml:space="preserve"> a per-pixel detection threshold for slope, aspect, and </w:t>
+      </w:r>
+      <w:del w:id="1021" w:author="Colton Goodrich" w:date="2026-07-09T12:00:00Z">
+        <w:r>
+          <w:delText xml:space="preserve">sensor.</w:delText>
+        </w:r>
+      </w:del>
+      <w:ins w:id="1022" w:author="Colton Goodrich" w:date="2026-07-09T12:00:00Z">
+        <w:r>
+          <w:t xml:space="preserve">sensor, in place of a single valley-wide noise value.</w:t>
+        </w:r>
+      </w:ins>
+      <w:r>
+        <w:t xml:space="preserve"> Success test: on ground that did not change, a 95% confidence threshold should be exceeded by 5% of pixels.</w:t>
       </w:r>
       <w:commentRangeEnd w:id="93"/>
       <w:r>
@@ -561,26 +629,26 @@
           <w:color w:val="404040"/>
           <w:sz w:val="18"/>
         </w:rPr>
-        <w:t xml:space="preserve">Figure 2. </w:t>
-      </w:r>
-      <w:del w:id="1013" w:author="Colton Goodrich" w:date="2026-07-09T12:00:00Z">
+        <w:t xml:space="preserve">Figure 2. Planned detection-to-attribution workflow: three DEM epochs, </w:t>
+      </w:r>
+      <w:del w:id="1023" w:author="Colton Goodrich" w:date="2026-07-09T12:00:00Z">
         <w:r>
           <w:rPr>
             <w:i/>
             <w:color w:val="404040"/>
             <w:sz w:val="18"/>
           </w:rPr>
-          <w:delText xml:space="preserve">Planned detection-to-attribution workflow: three DEM epochs, co-registration, DEM-of-Difference, per-pixel detection floor, then the O1 (channel), O2 (valley-floor), and O3 (uncertainty) objectives. </w:delText>
+          <w:delText xml:space="preserve">co-registration,</w:delText>
         </w:r>
       </w:del>
-      <w:ins w:id="1014" w:author="Colton Goodrich" w:date="2026-07-09T12:00:00Z">
+      <w:ins w:id="1024" w:author="Colton Goodrich" w:date="2026-07-09T12:00:00Z">
         <w:r>
           <w:rPr>
             <w:i/>
             <w:color w:val="404040"/>
             <w:sz w:val="18"/>
           </w:rPr>
-          <w:t xml:space="preserve">Planned detection-to-attribution workflow: three DEM epochs, co-registration to airborne-lidar and ICESat-2 control, DEM-of-Difference, per-pixel detection floor, then the O1 (channel), O2 (stream-corridor), and O3 (uncertainty) objectives. </w:t>
+          <w:t xml:space="preserve">co-registration to airborne-lidar and ICESat-2 control,</w:t>
         </w:r>
       </w:ins>
       <w:r>
@@ -589,7 +657,35 @@
           <w:color w:val="404040"/>
           <w:sz w:val="18"/>
         </w:rPr>
-        <w:t xml:space="preserve">Method schematic; no results shown.</w:t>
+        <w:t xml:space="preserve"> DEM-of-Difference, per-pixel detection floor, then the O1 (channel), O2 </w:t>
+      </w:r>
+      <w:del w:id="1025" w:author="Colton Goodrich" w:date="2026-07-09T12:00:00Z">
+        <w:r>
+          <w:rPr>
+            <w:i/>
+            <w:color w:val="404040"/>
+            <w:sz w:val="18"/>
+          </w:rPr>
+          <w:delText xml:space="preserve">(valley-floor),</w:delText>
+        </w:r>
+      </w:del>
+      <w:ins w:id="1026" w:author="Colton Goodrich" w:date="2026-07-09T12:00:00Z">
+        <w:r>
+          <w:rPr>
+            <w:i/>
+            <w:color w:val="404040"/>
+            <w:sz w:val="18"/>
+          </w:rPr>
+          <w:t xml:space="preserve">(stream-corridor),</w:t>
+        </w:r>
+      </w:ins>
+      <w:r>
+        <w:rPr>
+          <w:i/>
+          <w:color w:val="404040"/>
+          <w:sz w:val="18"/>
+        </w:rPr>
+        <w:t xml:space="preserve"> and O3 (uncertainty) objectives. Method schematic; no results shown.</w:t>
       </w:r>
       <w:commentRangeEnd w:id="94"/>
       <w:r>
@@ -621,16 +717,103 @@
         </w:numPr>
       </w:pPr>
       <w:commentRangeStart w:id="95"/>
-      <w:del w:id="1015" w:author="Colton Goodrich" w:date="2026-07-09T12:00:00Z">
-        <w:r>
-          <w:delText xml:space="preserve">Compute each gauged stream's change rate. First I co-register the two elevation epochs (removing the median vertical offset over stable ground, with an optional ICP refinement), resample them to a shared grid, and difference them. I keep only pixels whose change clears the detection floor (the per-pixel LOD95 threshold from objective 3), sum that change inside the stream's channel outline, and normalize by channel area and years elapsed to a specific rate in mm/yr.</w:delText>
+      <w:del w:id="1027" w:author="Colton Goodrich" w:date="2026-07-09T12:00:00Z">
+        <w:r>
+          <w:delText xml:space="preserve">Compute</w:delText>
         </w:r>
       </w:del>
-      <w:ins w:id="1016" w:author="Colton Goodrich" w:date="2026-07-09T12:00:00Z">
-        <w:r>
-          <w:t xml:space="preserve">Objective 1 tests whether melt energy predicts channel change better than water volume alone. To test it, I measure each gauged stream's change rate: co-register the two elevation epochs (removing the median vertical offset over stable ground, with an optional ICP refinement), resample to a shared grid, difference them, keep only pixels whose change clears the detection floor (the per-pixel LOD95 threshold from objective 3), and integrate that change inside the channel outline, normalized by channel area and years elapsed to a rate in mm/yr.</w:t>
+      <w:ins w:id="1028" w:author="Colton Goodrich" w:date="2026-07-09T12:00:00Z">
+        <w:r>
+          <w:t xml:space="preserve">Objective 1 tests whether melt energy predicts channel change better than water volume alone. To test it, I measure</w:t>
         </w:r>
       </w:ins>
+      <w:r>
+        <w:t xml:space="preserve"> each gauged stream's change </w:t>
+      </w:r>
+      <w:del w:id="1029" w:author="Colton Goodrich" w:date="2026-07-09T12:00:00Z">
+        <w:r>
+          <w:delText xml:space="preserve">rate. First I</w:delText>
+        </w:r>
+      </w:del>
+      <w:ins w:id="1030" w:author="Colton Goodrich" w:date="2026-07-09T12:00:00Z">
+        <w:r>
+          <w:t xml:space="preserve">rate:</w:t>
+        </w:r>
+      </w:ins>
+      <w:r>
+        <w:t xml:space="preserve"> co-register the two elevation epochs (removing the median vertical offset over stable ground, with an optional ICP refinement), resample </w:t>
+      </w:r>
+      <w:del w:id="1031" w:author="Colton Goodrich" w:date="2026-07-09T12:00:00Z">
+        <w:r>
+          <w:delText xml:space="preserve">them </w:delText>
+        </w:r>
+      </w:del>
+      <w:r>
+        <w:t xml:space="preserve">to a shared grid, </w:t>
+      </w:r>
+      <w:del w:id="1032" w:author="Colton Goodrich" w:date="2026-07-09T12:00:00Z">
+        <w:r>
+          <w:delText xml:space="preserve">and </w:delText>
+        </w:r>
+      </w:del>
+      <w:r>
+        <w:t xml:space="preserve">difference </w:t>
+      </w:r>
+      <w:del w:id="1033" w:author="Colton Goodrich" w:date="2026-07-09T12:00:00Z">
+        <w:r>
+          <w:delText xml:space="preserve">them. I</w:delText>
+        </w:r>
+      </w:del>
+      <w:ins w:id="1034" w:author="Colton Goodrich" w:date="2026-07-09T12:00:00Z">
+        <w:r>
+          <w:t xml:space="preserve">them,</w:t>
+        </w:r>
+      </w:ins>
+      <w:r>
+        <w:t xml:space="preserve"> keep only pixels whose change clears the detection floor (the per-pixel LOD95 threshold from objective 3), </w:t>
+      </w:r>
+      <w:del w:id="1035" w:author="Colton Goodrich" w:date="2026-07-09T12:00:00Z">
+        <w:r>
+          <w:delText xml:space="preserve">sum</w:delText>
+        </w:r>
+      </w:del>
+      <w:ins w:id="1036" w:author="Colton Goodrich" w:date="2026-07-09T12:00:00Z">
+        <w:r>
+          <w:t xml:space="preserve">and integrate</w:t>
+        </w:r>
+      </w:ins>
+      <w:r>
+        <w:t xml:space="preserve"> that change inside the </w:t>
+      </w:r>
+      <w:del w:id="1037" w:author="Colton Goodrich" w:date="2026-07-09T12:00:00Z">
+        <w:r>
+          <w:delText xml:space="preserve">stream's </w:delText>
+        </w:r>
+      </w:del>
+      <w:r>
+        <w:t xml:space="preserve">channel outline, </w:t>
+      </w:r>
+      <w:del w:id="1038" w:author="Colton Goodrich" w:date="2026-07-09T12:00:00Z">
+        <w:r>
+          <w:delText xml:space="preserve">and normalize</w:delText>
+        </w:r>
+      </w:del>
+      <w:ins w:id="1039" w:author="Colton Goodrich" w:date="2026-07-09T12:00:00Z">
+        <w:r>
+          <w:t xml:space="preserve">normalized</w:t>
+        </w:r>
+      </w:ins>
+      <w:r>
+        <w:t xml:space="preserve"> by channel area and years elapsed to a </w:t>
+      </w:r>
+      <w:del w:id="1040" w:author="Colton Goodrich" w:date="2026-07-09T12:00:00Z">
+        <w:r>
+          <w:delText xml:space="preserve">specific </w:delText>
+        </w:r>
+      </w:del>
+      <w:r>
+        <w:t xml:space="preserve">rate in mm/yr.</w:t>
+      </w:r>
     </w:p>
     <w:p>
       <w:pPr>
@@ -686,14 +869,51 @@
           <w:numId w:val="6"/>
         </w:numPr>
       </w:pPr>
-      <w:del w:id="1017" w:author="Colton Goodrich" w:date="2026-07-09T12:00:00Z">
-        <w:r>
-          <w:delText xml:space="preserve">Apply the objective-3 per-pixel thresholds across the whole valley floor and pull out each change patch as a connected group of super-threshold pixels. I drop patches below a minimum mapping unit (a few pixels) to suppress isolated-pixel noise, and screen out near-level standing water, whose apparent change is lake-level rise, not ground change — those go to the lake-margin class and lake-level driver instead.</w:delText>
+      <w:r>
+        <w:t xml:space="preserve">Apply the objective-3 per-pixel thresholds </w:t>
+      </w:r>
+      <w:del w:id="1041" w:author="Colton Goodrich" w:date="2026-07-09T12:00:00Z">
+        <w:r>
+          <w:delText xml:space="preserve">across the whole valley floor</w:delText>
         </w:r>
       </w:del>
-      <w:ins w:id="1018" w:author="Colton Goodrich" w:date="2026-07-09T12:00:00Z">
-        <w:r>
-          <w:t xml:space="preserve">Apply the objective-3 per-pixel thresholds along the stream corridor and pull out each change patch as a connected group of super-threshold pixels, dropping patches below a minimum mapping unit to suppress isolated-pixel noise. Bedrock and stable soils flanking the corridor supply the fixed reference used to co-register the sensors, so change is measured against genuinely stable ground.</w:t>
+      <w:ins w:id="1042" w:author="Colton Goodrich" w:date="2026-07-09T12:00:00Z">
+        <w:r>
+          <w:t xml:space="preserve">along the stream corridor</w:t>
+        </w:r>
+      </w:ins>
+      <w:r>
+        <w:t xml:space="preserve"> and pull out each change patch as a connected group of super-threshold </w:t>
+      </w:r>
+      <w:del w:id="1043" w:author="Colton Goodrich" w:date="2026-07-09T12:00:00Z">
+        <w:r>
+          <w:delText xml:space="preserve">pixels. I drop</w:delText>
+        </w:r>
+      </w:del>
+      <w:ins w:id="1044" w:author="Colton Goodrich" w:date="2026-07-09T12:00:00Z">
+        <w:r>
+          <w:t xml:space="preserve">pixels, dropping</w:t>
+        </w:r>
+      </w:ins>
+      <w:r>
+        <w:t xml:space="preserve"> patches below a minimum mapping unit </w:t>
+      </w:r>
+      <w:del w:id="1045" w:author="Colton Goodrich" w:date="2026-07-09T12:00:00Z">
+        <w:r>
+          <w:delText xml:space="preserve">(a few pixels) </w:delText>
+        </w:r>
+      </w:del>
+      <w:r>
+        <w:t xml:space="preserve">to suppress isolated-pixel </w:t>
+      </w:r>
+      <w:del w:id="1046" w:author="Colton Goodrich" w:date="2026-07-09T12:00:00Z">
+        <w:r>
+          <w:delText xml:space="preserve">noise, and screen out near-level standing water, whose apparent change is lake-level rise, not ground change — those go to the lake-margin class and lake-level driver instead.</w:delText>
+        </w:r>
+      </w:del>
+      <w:ins w:id="1047" w:author="Colton Goodrich" w:date="2026-07-09T12:00:00Z">
+        <w:r>
+          <w:t xml:space="preserve">noise. Bedrock and stable soils flanking the corridor supply the fixed reference used to co-register the sensors, so change is measured against genuinely stable ground.</w:t>
         </w:r>
       </w:ins>
     </w:p>
@@ -1337,14 +1557,14 @@
       </w:tr>
       <w:tr>
         <w:trPr>
-          <w:ins w:id="1029" w:author="Colton Goodrich" w:date="2026-07-09T12:00:00Z"/>
+          <w:ins w:id="1064" w:author="Colton Goodrich" w:date="2026-07-09T12:00:00Z"/>
         </w:trPr>
         <w:tc>
           <w:tcPr>
             <w:tcW w:type="dxa" w:w="3114"/>
           </w:tcPr>
           <w:p>
-            <w:ins w:id="1030" w:author="Colton Goodrich" w:date="2026-07-09T12:00:00Z">
+            <w:ins w:id="1065" w:author="Colton Goodrich" w:date="2026-07-09T12:00:00Z">
               <w:r>
                 <w:t xml:space="preserve">ICESat-2 elevation (external control)</w:t>
               </w:r>
@@ -1356,7 +1576,7 @@
             <w:tcW w:type="dxa" w:w="3129"/>
           </w:tcPr>
           <w:p>
-            <w:ins w:id="1031" w:author="Colton Goodrich" w:date="2026-07-09T12:00:00Z">
+            <w:ins w:id="1066" w:author="Colton Goodrich" w:date="2026-07-09T12:00:00Z">
               <w:r>
                 <w:t xml:space="preserve">NASA NSIDC DAAC</w:t>
               </w:r>
@@ -1368,7 +1588,7 @@
             <w:tcW w:type="dxa" w:w="3107"/>
           </w:tcPr>
           <w:p>
-            <w:ins w:id="1032" w:author="Colton Goodrich" w:date="2026-07-09T12:00:00Z">
+            <w:ins w:id="1067" w:author="Colton Goodrich" w:date="2026-07-09T12:00:00Z">
               <w:r>
                 <w:t xml:space="preserve">public, free</w:t>
               </w:r>
@@ -1394,14 +1614,43 @@
     </w:p>
     <w:p>
       <w:commentRangeStart w:id="97"/>
-      <w:del w:id="1019" w:author="Colton Goodrich" w:date="2026-07-09T12:00:00Z">
-        <w:r>
-          <w:delText xml:space="preserve">A single workstation GPU trains the segmentation models; the elevation processing is CPU-bound and modest. No supercomputer allocation is required. Full-valley raster stacks reach tens of gigabytes and need only local storage, not specialized infrastructure.</w:delText>
+      <w:r>
+        <w:t xml:space="preserve">A single workstation GPU trains the segmentation </w:t>
+      </w:r>
+      <w:del w:id="1048" w:author="Colton Goodrich" w:date="2026-07-09T12:00:00Z">
+        <w:r>
+          <w:delText xml:space="preserve">models;</w:delText>
         </w:r>
       </w:del>
-      <w:ins w:id="1020" w:author="Colton Goodrich" w:date="2026-07-09T12:00:00Z">
-        <w:r>
-          <w:t xml:space="preserve">A single workstation GPU trains the segmentation models, and the elevation processing is CPU-bound and modest. Free access to the host institution's high-performance computing cluster is available for any heavier batch processing, though the project does not depend on it. Raster stacks reach tens of gigabytes and need only local storage.</w:t>
+      <w:ins w:id="1049" w:author="Colton Goodrich" w:date="2026-07-09T12:00:00Z">
+        <w:r>
+          <w:t xml:space="preserve">models, and</w:t>
+        </w:r>
+      </w:ins>
+      <w:r>
+        <w:t xml:space="preserve"> the elevation processing is CPU-bound and modest. </w:t>
+      </w:r>
+      <w:del w:id="1050" w:author="Colton Goodrich" w:date="2026-07-09T12:00:00Z">
+        <w:r>
+          <w:delText xml:space="preserve">No supercomputer allocation is required. Full-valley raster</w:delText>
+        </w:r>
+      </w:del>
+      <w:ins w:id="1051" w:author="Colton Goodrich" w:date="2026-07-09T12:00:00Z">
+        <w:r>
+          <w:t xml:space="preserve">Free access to the host institution's high-performance computing cluster is available for any heavier batch processing, though the project does not depend on it. Raster</w:t>
+        </w:r>
+      </w:ins>
+      <w:r>
+        <w:t xml:space="preserve"> stacks reach tens of gigabytes and need only local </w:t>
+      </w:r>
+      <w:del w:id="1052" w:author="Colton Goodrich" w:date="2026-07-09T12:00:00Z">
+        <w:r>
+          <w:delText xml:space="preserve">storage, not specialized infrastructure.</w:delText>
+        </w:r>
+      </w:del>
+      <w:ins w:id="1053" w:author="Colton Goodrich" w:date="2026-07-09T12:00:00Z">
+        <w:r>
+          <w:t xml:space="preserve">storage.</w:t>
         </w:r>
       </w:ins>
       <w:commentRangeEnd w:id="97"/>
@@ -1429,7 +1678,7 @@
       </w:r>
     </w:p>
     <w:p>
-      <w:del w:id="1021" w:author="Colton Goodrich" w:date="2026-07-09T12:00:00Z">
+      <w:del w:id="1054" w:author="Colton Goodrich" w:date="2026-07-09T12:00:00Z">
         <w:r>
           <w:rPr>
             <w:b/>
@@ -1438,7 +1687,7 @@
           <w:delText xml:space="preserve">Community Contact</w:delText>
         </w:r>
       </w:del>
-      <w:ins w:id="1022" w:author="Colton Goodrich" w:date="2026-07-09T12:00:00Z">
+      <w:ins w:id="1055" w:author="Colton Goodrich" w:date="2026-07-09T12:00:00Z">
         <w:r>
           <w:rPr>
             <w:b/>
@@ -1450,14 +1699,27 @@
     </w:p>
     <w:p>
       <w:commentRangeStart w:id="98"/>
-      <w:del w:id="1023" w:author="Colton Goodrich" w:date="2026-07-09T12:00:00Z">
-        <w:r>
-          <w:delText xml:space="preserve">The dissertation author has been contacted and is responsive. Continued cooperation helps but is not vital: every analysis can proceed from public data.</w:delText>
+      <w:del w:id="1056" w:author="Colton Goodrich" w:date="2026-07-09T12:00:00Z">
+        <w:r>
+          <w:delText xml:space="preserve">The dissertation author has been contacted and is responsive. Continued cooperation helps but is not vital: every analysis</w:delText>
         </w:r>
       </w:del>
-      <w:ins w:id="1024" w:author="Colton Goodrich" w:date="2026-07-09T12:00:00Z">
-        <w:r>
-          <w:t xml:space="preserve">Results will reach the cryosphere community through presentations at AGU and polar-science meetings and through open-access publications and archived data products with DOIs. Because the analysis relies only on public data, it can proceed independently.</w:t>
+      <w:ins w:id="1057" w:author="Colton Goodrich" w:date="2026-07-09T12:00:00Z">
+        <w:r>
+          <w:t xml:space="preserve">Results will reach the cryosphere community through presentations at AGU and polar-science meetings and through open-access publications and archived data products with DOIs. Because the analysis relies only on public data, it</w:t>
+        </w:r>
+      </w:ins>
+      <w:r>
+        <w:t xml:space="preserve"> can proceed </w:t>
+      </w:r>
+      <w:del w:id="1058" w:author="Colton Goodrich" w:date="2026-07-09T12:00:00Z">
+        <w:r>
+          <w:delText xml:space="preserve">from public data.</w:delText>
+        </w:r>
+      </w:del>
+      <w:ins w:id="1059" w:author="Colton Goodrich" w:date="2026-07-09T12:00:00Z">
+        <w:r>
+          <w:t xml:space="preserve">independently.</w:t>
         </w:r>
       </w:ins>
       <w:commentRangeEnd w:id="98"/>
@@ -1542,16 +1804,16 @@
     </w:p>
     <w:p>
       <w:r>
-        <w:t xml:space="preserve">Outside the channels, change may be too small to detect. The valley floors change slowly, so much of the surface may sit below our detection threshold. </w:t>
-      </w:r>
-      <w:del w:id="1025" w:author="Colton Goodrich" w:date="2026-07-09T12:00:00Z">
-        <w:r>
-          <w:delText xml:space="preserve">If so, objective 2 narrows back to in-channel change and the landscape-wide result is reported accordingly.</w:delText>
+        <w:t xml:space="preserve">Outside the channels, change may be too small to detect. The valley floors change slowly, so much of the surface may sit below our detection threshold. If so, objective 2 </w:t>
+      </w:r>
+      <w:del w:id="1060" w:author="Colton Goodrich" w:date="2026-07-09T12:00:00Z">
+        <w:r>
+          <w:delText xml:space="preserve">narrows back to in-channel change and the landscape-wide result is reported accordingly.</w:delText>
         </w:r>
       </w:del>
-      <w:ins w:id="1026" w:author="Colton Goodrich" w:date="2026-07-09T12:00:00Z">
-        <w:r>
-          <w:t xml:space="preserve">If so, objective 2 stays tight to the channel and its immediate margins, and results are reported at that scope.</w:t>
+      <w:ins w:id="1061" w:author="Colton Goodrich" w:date="2026-07-09T12:00:00Z">
+        <w:r>
+          <w:t xml:space="preserve">stays tight to the channel and its immediate margins, and results are reported at that scope.</w:t>
         </w:r>
       </w:ins>
     </w:p>
@@ -1730,24 +1992,31 @@
             <w:pPr>
               <w:spacing w:after="20"/>
             </w:pPr>
-            <w:del w:id="1027" w:author="Colton Goodrich" w:date="2026-07-09T12:00:00Z">
+            <w:del w:id="1062" w:author="Colton Goodrich" w:date="2026-07-09T12:00:00Z">
               <w:r>
                 <w:rPr>
                   <w:rFonts w:ascii="Calibri" w:hAnsi="Calibri"/>
                   <w:sz w:val="18"/>
                 </w:rPr>
-                <w:delText xml:space="preserve">Landscape-wide change detection + process-type classification (O2), gated by the O3 thresholds; driver tests per change type; sensor-disagreement correction</w:delText>
+                <w:delText xml:space="preserve">Landscape-wide change detection + process-type classification</w:delText>
               </w:r>
             </w:del>
-            <w:ins w:id="1028" w:author="Colton Goodrich" w:date="2026-07-09T12:00:00Z">
+            <w:ins w:id="1063" w:author="Colton Goodrich" w:date="2026-07-09T12:00:00Z">
               <w:r>
                 <w:rPr>
                   <w:rFonts w:ascii="Calibri" w:hAnsi="Calibri"/>
                   <w:sz w:val="18"/>
                 </w:rPr>
-                <w:t xml:space="preserve">Stream-corridor process attribution (O2), gated by the O3 thresholds; driver tests per change type; sensor-disagreement correction</w:t>
+                <w:t xml:space="preserve">Stream-corridor process attribution</w:t>
               </w:r>
             </w:ins>
+            <w:r>
+              <w:rPr>
+                <w:rFonts w:ascii="Calibri" w:hAnsi="Calibri"/>
+                <w:sz w:val="18"/>
+              </w:rPr>
+              <w:t xml:space="preserve"> (O2), gated by the O3 thresholds; driver tests per change type; sensor-disagreement correction</w:t>
+            </w:r>
           </w:p>
         </w:tc>
         <w:tc>

</xml_diff>